<commit_message>
v1.1.0: reporte integrado, notebook ejecutado, ampliación estadística y pruebas CI
</commit_message>
<xml_diff>
--- a/documentos/Actividad6_Eduardo_Aburto.docx
+++ b/documentos/Actividad6_Eduardo_Aburto.docx
@@ -773,7 +773,7 @@
           </w:tcPr>
           <w:p>
             <w:r>
-              <w:t>ChatGPT/Codex apoyó la programación, ejecución, verificación y elaboración de esta entrega. Las métricas provienen de ejecuciones registradas. La prueba A/B utiliza resultados simulados y se identifica como tal.</w:t>
+              <w:t>ChatGPT/Codex: programación, ejecución y verificación; edición académica, figuras, cuaderno con salidas y revisión de cumplimiento 1.1.0. Las métricas proceden de ejecuciones; el A/B es simulado.</w:t>
             </w:r>
           </w:p>
         </w:tc>
@@ -828,7 +828,7 @@
           </w:tcPr>
           <w:p>
             <w:r>
-              <w:t>Antecedentes</w:t>
+              <w:t>Sí</w:t>
             </w:r>
           </w:p>
         </w:tc>
@@ -851,7 +851,7 @@
           </w:tcPr>
           <w:p>
             <w:r>
-              <w:t>Uso declarado en entregas previas; no se atribuyen nuevas ejecuciones a esta herramienta.</w:t>
+              <w:t>Claude (Anthropic): revisión externa de cumplimiento y propuesta de mejoras aportada por el autor. Codex contrastó los cálculos adicionales con los archivos del repositorio.</w:t>
             </w:r>
           </w:p>
         </w:tc>
@@ -1123,13 +1123,28 @@
       </w:r>
     </w:p>
     <w:p>
-      <w:r>
-        <w:t>Mi prioridad como Banquero Patrimonial Sr. es preparar revisiones que protejan el perfil de inversión y busquen mejores rendimientos netos para el cliente. Seleccioné una SVM calibrada como candidata de investigación para detectar noticias financieras negativas. Con un umbral de 0.20 recupera 51 de 61 noticias negativas del test histórico. Aun así, no alcanza el recall de 90 % que fijé como meta; por eso no propongo automatizar movimientos ni iniciar un despliegue operativo.</w:t>
-      </w:r>
-    </w:p>
-    <w:p>
-      <w:r>
-        <w:t>El asistente organiza señales para revisión humana. Una noticia negativa no demuestra que un fondo vaya a caer, ni justifica por sí sola venderlo. Antes de cualquier migración se necesita vincular la noticia con exposiciones reales, contrastar fuentes, revisar horizonte, liquidez, perfil y costos. Esta actividad evalúa el primer componente de ese proceso, no una estrategia de inversión.</w:t>
+      <w:pPr>
+        <w:shd w:fill="EAF3FA"/>
+      </w:pPr>
+      <w:r>
+        <w:t>Resumen ejecutivo. Mantengo la SVM calibrada como candidata académica: umbral 0.20, recall 0.8361, precisión 0.6711 y AUC 0.9548; recupera 51 noticias negativas. La meta conjunta no se alcanza. Como Banquero Patrimonial Sr. en Xalapa, priorizo reducir omisiones sin saturar la revisión ni inducir movimientos innecesarios. El test es retrospectivo y el A/B es simulado. La evidencia favorece investigar esta alternativa, pero no autoriza un despliegue ni demuestra mayor rentabilidad. La IA no sustituye el criterio del banquero; lo aumenta.</w:t>
+      </w:r>
+    </w:p>
+    <w:p>
+      <w:r>
+        <w:t>El asistente prepara revisiones para banqueros patrimoniales, privados y corredores. Una noticia negativa no es una orden de inversión: requiere vincularla con exposiciones reales, contrastar fuentes y revisar perfil, horizonte, liquidez y costos. Evalúo detección de noticias, no una estrategia de rentabilidad (Universidad Tecmilenio, 2026a, 2026b).</w:t>
+      </w:r>
+    </w:p>
+    <w:p>
+      <w:pPr>
+        <w:keepNext/>
+      </w:pPr>
+      <w:r>
+        <w:rPr>
+          <w:i/>
+          <w:sz w:val="18"/>
+        </w:rPr>
+        <w:t>Tabla 1. Objetivo SMART y criterio de evaluación</w:t>
       </w:r>
     </w:p>
     <w:tbl>
@@ -1149,7 +1164,7 @@
         </w:trPr>
         <w:tc>
           <w:tcPr>
-            <w:tcW w:type="dxa" w:w="4464"/>
+            <w:tcW w:type="dxa" w:w="2016"/>
             <w:shd w:fill="004481"/>
           </w:tcPr>
           <w:p>
@@ -1162,13 +1177,13 @@
                 <w:color w:val="FFFFFF"/>
                 <w:sz w:val="18"/>
               </w:rPr>
-              <w:t>Objetivo SMART al cierre del 22 de octubre de 2026</w:t>
-            </w:r>
-          </w:p>
-        </w:tc>
-        <w:tc>
-          <w:tcPr>
-            <w:tcW w:type="dxa" w:w="4896"/>
+              <w:t>Letra y atributo</w:t>
+            </w:r>
+          </w:p>
+        </w:tc>
+        <w:tc>
+          <w:tcPr>
+            <w:tcW w:type="dxa" w:w="7344"/>
             <w:shd w:fill="004481"/>
           </w:tcPr>
           <w:p>
@@ -1181,7 +1196,7 @@
                 <w:color w:val="FFFFFF"/>
                 <w:sz w:val="18"/>
               </w:rPr>
-              <w:t>Criterio y resultado</w:t>
+              <w:t>Compromiso</w:t>
             </w:r>
           </w:p>
         </w:tc>
@@ -1192,39 +1207,39 @@
         </w:trPr>
         <w:tc>
           <w:tcPr>
-            <w:tcW w:type="dxa" w:w="4464"/>
-            <w:shd w:fill="F1F6FA"/>
-          </w:tcPr>
-          <w:p>
-            <w:pPr>
-              <w:spacing w:after="60" w:before="60"/>
-            </w:pPr>
-            <w:r>
-              <w:rPr>
-                <w:b w:val="0"/>
-                <w:color w:val="222222"/>
-                <w:sz w:val="18"/>
-              </w:rPr>
-              <w:t>Específico y medible</w:t>
-            </w:r>
-          </w:p>
-        </w:tc>
-        <w:tc>
-          <w:tcPr>
-            <w:tcW w:type="dxa" w:w="4896"/>
-            <w:shd w:fill="F1F6FA"/>
-          </w:tcPr>
-          <w:p>
-            <w:pPr>
-              <w:spacing w:after="60" w:before="60"/>
-            </w:pPr>
-            <w:r>
-              <w:rPr>
-                <w:b w:val="0"/>
-                <w:color w:val="222222"/>
-                <w:sz w:val="18"/>
-              </w:rPr>
-              <w:t>Evaluar detección binaria de noticias negativas con recall ≥0.90, precisión ≥0.60 y AUC ≥0.90.</w:t>
+            <w:tcW w:type="dxa" w:w="2016"/>
+            <w:shd w:fill="F1F6FA"/>
+          </w:tcPr>
+          <w:p>
+            <w:pPr>
+              <w:spacing w:after="60" w:before="60"/>
+            </w:pPr>
+            <w:r>
+              <w:rPr>
+                <w:b w:val="0"/>
+                <w:color w:val="222222"/>
+                <w:sz w:val="18"/>
+              </w:rPr>
+              <w:t>S · Específico</w:t>
+            </w:r>
+          </w:p>
+        </w:tc>
+        <w:tc>
+          <w:tcPr>
+            <w:tcW w:type="dxa" w:w="7344"/>
+            <w:shd w:fill="F1F6FA"/>
+          </w:tcPr>
+          <w:p>
+            <w:pPr>
+              <w:spacing w:after="60" w:before="60"/>
+            </w:pPr>
+            <w:r>
+              <w:rPr>
+                <w:b w:val="0"/>
+                <w:color w:val="222222"/>
+                <w:sz w:val="18"/>
+              </w:rPr>
+              <w:t>Detectar noticias negativas para priorizar revisión humana de portafolios.</w:t>
             </w:r>
           </w:p>
         </w:tc>
@@ -1235,39 +1250,39 @@
         </w:trPr>
         <w:tc>
           <w:tcPr>
-            <w:tcW w:type="dxa" w:w="4464"/>
-            <w:shd w:fill="F1F6FA"/>
-          </w:tcPr>
-          <w:p>
-            <w:pPr>
-              <w:spacing w:after="60" w:before="60"/>
-            </w:pPr>
-            <w:r>
-              <w:rPr>
-                <w:b w:val="0"/>
-                <w:color w:val="222222"/>
-                <w:sz w:val="18"/>
-              </w:rPr>
-              <w:t>Alcance realizable</w:t>
-            </w:r>
-          </w:p>
-        </w:tc>
-        <w:tc>
-          <w:tcPr>
-            <w:tcW w:type="dxa" w:w="4896"/>
-            <w:shd w:fill="F1F6FA"/>
-          </w:tcPr>
-          <w:p>
-            <w:pPr>
-              <w:spacing w:after="60" w:before="60"/>
-            </w:pPr>
-            <w:r>
-              <w:rPr>
-                <w:b w:val="0"/>
-                <w:color w:val="222222"/>
-                <w:sz w:val="18"/>
-              </w:rPr>
-              <w:t>Comparar dos algoritmos y dos baselines, fijar umbral sólo en desarrollo y registrar parámetros, métricas y artefactos.</w:t>
+            <w:tcW w:type="dxa" w:w="2016"/>
+            <w:shd w:fill="FFFFFF"/>
+          </w:tcPr>
+          <w:p>
+            <w:pPr>
+              <w:spacing w:after="60" w:before="60"/>
+            </w:pPr>
+            <w:r>
+              <w:rPr>
+                <w:b w:val="0"/>
+                <w:color w:val="222222"/>
+                <w:sz w:val="18"/>
+              </w:rPr>
+              <w:t>M · Medible</w:t>
+            </w:r>
+          </w:p>
+        </w:tc>
+        <w:tc>
+          <w:tcPr>
+            <w:tcW w:type="dxa" w:w="7344"/>
+            <w:shd w:fill="FFFFFF"/>
+          </w:tcPr>
+          <w:p>
+            <w:pPr>
+              <w:spacing w:after="60" w:before="60"/>
+            </w:pPr>
+            <w:r>
+              <w:rPr>
+                <w:b w:val="0"/>
+                <w:color w:val="222222"/>
+                <w:sz w:val="18"/>
+              </w:rPr>
+              <w:t>Recall ≥0.90, precisión ≥0.60 y AUC ≥0.90; costo didáctico 5FN+FP.</w:t>
             </w:r>
           </w:p>
         </w:tc>
@@ -1278,39 +1293,39 @@
         </w:trPr>
         <w:tc>
           <w:tcPr>
-            <w:tcW w:type="dxa" w:w="4464"/>
-            <w:shd w:fill="F1F6FA"/>
-          </w:tcPr>
-          <w:p>
-            <w:pPr>
-              <w:spacing w:after="60" w:before="60"/>
-            </w:pPr>
-            <w:r>
-              <w:rPr>
-                <w:b w:val="0"/>
-                <w:color w:val="222222"/>
-                <w:sz w:val="18"/>
-              </w:rPr>
-              <w:t>Relevancia</w:t>
-            </w:r>
-          </w:p>
-        </w:tc>
-        <w:tc>
-          <w:tcPr>
-            <w:tcW w:type="dxa" w:w="4896"/>
-            <w:shd w:fill="F1F6FA"/>
-          </w:tcPr>
-          <w:p>
-            <w:pPr>
-              <w:spacing w:after="60" w:before="60"/>
-            </w:pPr>
-            <w:r>
-              <w:rPr>
-                <w:b w:val="0"/>
-                <w:color w:val="222222"/>
-                <w:sz w:val="18"/>
-              </w:rPr>
-              <w:t>Reducir omisiones con una carga de revisión asumible. Costo didáctico: 5 por falso negativo y 1 por falso positivo.</w:t>
+            <w:tcW w:type="dxa" w:w="2016"/>
+            <w:shd w:fill="F1F6FA"/>
+          </w:tcPr>
+          <w:p>
+            <w:pPr>
+              <w:spacing w:after="60" w:before="60"/>
+            </w:pPr>
+            <w:r>
+              <w:rPr>
+                <w:b w:val="0"/>
+                <w:color w:val="222222"/>
+                <w:sz w:val="18"/>
+              </w:rPr>
+              <w:t>A · Alcanzable</w:t>
+            </w:r>
+          </w:p>
+        </w:tc>
+        <w:tc>
+          <w:tcPr>
+            <w:tcW w:type="dxa" w:w="7344"/>
+            <w:shd w:fill="F1F6FA"/>
+          </w:tcPr>
+          <w:p>
+            <w:pPr>
+              <w:spacing w:after="60" w:before="60"/>
+            </w:pPr>
+            <w:r>
+              <w:rPr>
+                <w:b w:val="0"/>
+                <w:color w:val="222222"/>
+                <w:sz w:val="18"/>
+              </w:rPr>
+              <w:t>Comparar dos algoritmos y dos baselines con datos públicos y CPU; las metas son hipótesis a evaluar, no resultados garantizados.</w:t>
             </w:r>
           </w:p>
         </w:tc>
@@ -1321,39 +1336,82 @@
         </w:trPr>
         <w:tc>
           <w:tcPr>
-            <w:tcW w:type="dxa" w:w="4464"/>
-            <w:shd w:fill="F1F6FA"/>
-          </w:tcPr>
-          <w:p>
-            <w:pPr>
-              <w:spacing w:after="60" w:before="60"/>
-            </w:pPr>
-            <w:r>
-              <w:rPr>
-                <w:b w:val="0"/>
-                <w:color w:val="222222"/>
-                <w:sz w:val="18"/>
-              </w:rPr>
-              <w:t>Evaluación de la meta</w:t>
-            </w:r>
-          </w:p>
-        </w:tc>
-        <w:tc>
-          <w:tcPr>
-            <w:tcW w:type="dxa" w:w="4896"/>
-            <w:shd w:fill="F1F6FA"/>
-          </w:tcPr>
-          <w:p>
-            <w:pPr>
-              <w:spacing w:after="60" w:before="60"/>
-            </w:pPr>
-            <w:r>
-              <w:rPr>
-                <w:b w:val="0"/>
-                <w:color w:val="222222"/>
-                <w:sz w:val="18"/>
-              </w:rPr>
-              <w:t>SVM: recall 0.836, precisión 0.671, AUC 0.955. Meta conjunta no alcanzada. No se rebaja después de ver los resultados.</w:t>
+            <w:tcW w:type="dxa" w:w="2016"/>
+            <w:shd w:fill="FFFFFF"/>
+          </w:tcPr>
+          <w:p>
+            <w:pPr>
+              <w:spacing w:after="60" w:before="60"/>
+            </w:pPr>
+            <w:r>
+              <w:rPr>
+                <w:b w:val="0"/>
+                <w:color w:val="222222"/>
+                <w:sz w:val="18"/>
+              </w:rPr>
+              <w:t>R · Relevante</w:t>
+            </w:r>
+          </w:p>
+        </w:tc>
+        <w:tc>
+          <w:tcPr>
+            <w:tcW w:type="dxa" w:w="7344"/>
+            <w:shd w:fill="FFFFFF"/>
+          </w:tcPr>
+          <w:p>
+            <w:pPr>
+              <w:spacing w:after="60" w:before="60"/>
+            </w:pPr>
+            <w:r>
+              <w:rPr>
+                <w:b w:val="0"/>
+                <w:color w:val="222222"/>
+                <w:sz w:val="18"/>
+              </w:rPr>
+              <w:t>Controlar omisiones, carga operativa y riesgo reputacional; proteger el perfil del cliente.</w:t>
+            </w:r>
+          </w:p>
+        </w:tc>
+      </w:tr>
+      <w:tr>
+        <w:trPr>
+          <w:cantSplit/>
+        </w:trPr>
+        <w:tc>
+          <w:tcPr>
+            <w:tcW w:type="dxa" w:w="2016"/>
+            <w:shd w:fill="F1F6FA"/>
+          </w:tcPr>
+          <w:p>
+            <w:pPr>
+              <w:spacing w:after="60" w:before="60"/>
+            </w:pPr>
+            <w:r>
+              <w:rPr>
+                <w:b w:val="0"/>
+                <w:color w:val="222222"/>
+                <w:sz w:val="18"/>
+              </w:rPr>
+              <w:t>T · Temporal</w:t>
+            </w:r>
+          </w:p>
+        </w:tc>
+        <w:tc>
+          <w:tcPr>
+            <w:tcW w:type="dxa" w:w="7344"/>
+            <w:shd w:fill="F1F6FA"/>
+          </w:tcPr>
+          <w:p>
+            <w:pPr>
+              <w:spacing w:after="60" w:before="60"/>
+            </w:pPr>
+            <w:r>
+              <w:rPr>
+                <w:b w:val="0"/>
+                <w:color w:val="222222"/>
+                <w:sz w:val="18"/>
+              </w:rPr>
+              <w:t>Corte: 22 de octubre de 2026. Ventana: evaluación retrospectiva de la Semana 7; revisión documental 23 de octubre, sin ampliar la muestra.</w:t>
             </w:r>
           </w:p>
         </w:tc>
@@ -1364,17 +1422,17 @@
         <w:pStyle w:val="Ttulo1"/>
       </w:pPr>
       <w:r>
-        <w:t>Continuidad y alcance de los datos</w:t>
-      </w:r>
-    </w:p>
-    <w:p>
-      <w:r>
-        <w:t>Conservo Financial PhraseBank AllAgree y la partición de Actividad 5: 2,264 oraciones originales, cinco duplicados retirados, 2,259 registros limpios; 1,807 para desarrollo y 452 para test. La clase positiva ahora es negative; neutral y positive forman la clase no negativa. El cambio de tarea impide comparar directamente el F1 binario con el F1 macro de tres clases de la entrega anterior.</w:t>
-      </w:r>
-    </w:p>
-    <w:p>
-      <w:r>
-        <w:t>El test ya fue consultado en Actividad 5: esta evaluación es retrospectiva, no una validación externa independiente. Los 150 personajes con posiciones entre $5 y $20 millones MXN son ficticios y sirven para ilustrar perfiles y el experimento A/B. No aportan observaciones de rentabilidad ni etiquetas para entrenar el clasificador.</w:t>
+        <w:t>Datos y continuidad</w:t>
+      </w:r>
+    </w:p>
+    <w:p>
+      <w:r>
+        <w:t>Conservo Financial PhraseBank AllAgree: 2,264 oraciones originales, cinco duplicados retirados y 2,259 limpias; 1,807 para desarrollo y 452 para test. La clase positiva es noticia negativa: 61 negativas frente a 391 no negativas en test (13.50 %). Neutral y positiva se agrupan como no negativa; este F1 binario no es comparable directamente con el F1 macro de tres clases de Actividad 5 (Malo et al., 2014).</w:t>
+      </w:r>
+    </w:p>
+    <w:p>
+      <w:r>
+        <w:t>El test ya fue examinado en Actividad 5; no es una validación externa nueva. Los 150 superhéroes y villanos con $5–$20 millones MXN son ficticios, para representar perfiles didácticos sin datos personales. No entrenan el clasificador ni acreditan rentabilidad.</w:t>
       </w:r>
     </w:p>
     <w:p>
@@ -1387,12 +1445,24 @@
         <w:pStyle w:val="Ttulo1"/>
       </w:pPr>
       <w:r>
-        <w:t>Protocolo de datos y validación</w:t>
-      </w:r>
-    </w:p>
-    <w:p>
-      <w:r>
-        <w:t>Financial PhraseBank contiene oraciones financieras en inglés anotadas por personas; AllAgree conserva acuerdo total. Su licencia CC BY-NC-SA 3.0 permite esta entrega académica, pero requiere revisar derechos antes de uso comercial. La selección de ejemplos con acuerdo total y el idioma limitan la transferencia a noticias mexicanas actuales.</w:t>
+        <w:t>Protocolo de datos y modelos</w:t>
+      </w:r>
+    </w:p>
+    <w:p>
+      <w:r>
+        <w:t>AllAgree contiene noticias financieras en inglés con acuerdo total entre anotadores. El idioma, el origen y la selección por acuerdo limitan su transferencia a México. La licencia CC BY-NC-SA 3.0 no concede permiso comercial adicional. Conservo originales, licencia, manifiesto, hashes y partición histórica.</w:t>
+      </w:r>
+    </w:p>
+    <w:p>
+      <w:pPr>
+        <w:keepNext/>
+      </w:pPr>
+      <w:r>
+        <w:rPr>
+          <w:i/>
+          <w:sz w:val="18"/>
+        </w:rPr>
+        <w:t>Tabla 2. Diccionario de datos y controles</w:t>
       </w:r>
     </w:p>
     <w:tbl>
@@ -1412,7 +1482,7 @@
         </w:trPr>
         <w:tc>
           <w:tcPr>
-            <w:tcW w:type="dxa" w:w="2880"/>
+            <w:tcW w:type="dxa" w:w="2448"/>
             <w:shd w:fill="004481"/>
           </w:tcPr>
           <w:p>
@@ -1431,7 +1501,7 @@
         </w:tc>
         <w:tc>
           <w:tcPr>
-            <w:tcW w:type="dxa" w:w="6480"/>
+            <w:tcW w:type="dxa" w:w="6912"/>
             <w:shd w:fill="004481"/>
           </w:tcPr>
           <w:p>
@@ -1444,7 +1514,7 @@
                 <w:color w:val="FFFFFF"/>
                 <w:sz w:val="18"/>
               </w:rPr>
-              <w:t>Uso</w:t>
+              <w:t>Función y tratamiento</w:t>
             </w:r>
           </w:p>
         </w:tc>
@@ -1455,39 +1525,39 @@
         </w:trPr>
         <w:tc>
           <w:tcPr>
-            <w:tcW w:type="dxa" w:w="2880"/>
-            <w:shd w:fill="F1F6FA"/>
-          </w:tcPr>
-          <w:p>
-            <w:pPr>
-              <w:spacing w:after="60" w:before="60"/>
-            </w:pPr>
-            <w:r>
-              <w:rPr>
-                <w:b w:val="0"/>
-                <w:color w:val="222222"/>
-                <w:sz w:val="18"/>
-              </w:rPr>
-              <w:t>id y texto_original</w:t>
-            </w:r>
-          </w:p>
-        </w:tc>
-        <w:tc>
-          <w:tcPr>
-            <w:tcW w:type="dxa" w:w="6480"/>
-            <w:shd w:fill="F1F6FA"/>
-          </w:tcPr>
-          <w:p>
-            <w:pPr>
-              <w:spacing w:after="60" w:before="60"/>
-            </w:pPr>
-            <w:r>
-              <w:rPr>
-                <w:b w:val="0"/>
-                <w:color w:val="222222"/>
-                <w:sz w:val="18"/>
-              </w:rPr>
-              <w:t>Rastro al registro original y texto sin reinterpretar.</w:t>
+            <w:tcW w:type="dxa" w:w="2448"/>
+            <w:shd w:fill="F1F6FA"/>
+          </w:tcPr>
+          <w:p>
+            <w:pPr>
+              <w:spacing w:after="60" w:before="60"/>
+            </w:pPr>
+            <w:r>
+              <w:rPr>
+                <w:b w:val="0"/>
+                <w:color w:val="222222"/>
+                <w:sz w:val="18"/>
+              </w:rPr>
+              <w:t>id; texto_original</w:t>
+            </w:r>
+          </w:p>
+        </w:tc>
+        <w:tc>
+          <w:tcPr>
+            <w:tcW w:type="dxa" w:w="6912"/>
+            <w:shd w:fill="F1F6FA"/>
+          </w:tcPr>
+          <w:p>
+            <w:pPr>
+              <w:spacing w:after="60" w:before="60"/>
+            </w:pPr>
+            <w:r>
+              <w:rPr>
+                <w:b w:val="0"/>
+                <w:color w:val="222222"/>
+                <w:sz w:val="18"/>
+              </w:rPr>
+              <w:t>Identificador y texto conservado para trazabilidad.</w:t>
             </w:r>
           </w:p>
         </w:tc>
@@ -1498,8 +1568,8 @@
         </w:trPr>
         <w:tc>
           <w:tcPr>
-            <w:tcW w:type="dxa" w:w="2880"/>
-            <w:shd w:fill="F1F6FA"/>
+            <w:tcW w:type="dxa" w:w="2448"/>
+            <w:shd w:fill="FFFFFF"/>
           </w:tcPr>
           <w:p>
             <w:pPr>
@@ -1517,20 +1587,20 @@
         </w:tc>
         <w:tc>
           <w:tcPr>
-            <w:tcW w:type="dxa" w:w="6480"/>
-            <w:shd w:fill="F1F6FA"/>
-          </w:tcPr>
-          <w:p>
-            <w:pPr>
-              <w:spacing w:after="60" w:before="60"/>
-            </w:pPr>
-            <w:r>
-              <w:rPr>
-                <w:b w:val="0"/>
-                <w:color w:val="222222"/>
-                <w:sz w:val="18"/>
-              </w:rPr>
-              <w:t>Normalización Unicode NFKC y espacios; única entrada predictora.</w:t>
+            <w:tcW w:type="dxa" w:w="6912"/>
+            <w:shd w:fill="FFFFFF"/>
+          </w:tcPr>
+          <w:p>
+            <w:pPr>
+              <w:spacing w:after="60" w:before="60"/>
+            </w:pPr>
+            <w:r>
+              <w:rPr>
+                <w:b w:val="0"/>
+                <w:color w:val="222222"/>
+                <w:sz w:val="18"/>
+              </w:rPr>
+              <w:t>Unicode NFKC y espacios normalizados; única entrada predictora. Sin vacíos; no imputo ni traduzco.</w:t>
             </w:r>
           </w:p>
         </w:tc>
@@ -1541,39 +1611,39 @@
         </w:trPr>
         <w:tc>
           <w:tcPr>
-            <w:tcW w:type="dxa" w:w="2880"/>
-            <w:shd w:fill="F1F6FA"/>
-          </w:tcPr>
-          <w:p>
-            <w:pPr>
-              <w:spacing w:after="60" w:before="60"/>
-            </w:pPr>
-            <w:r>
-              <w:rPr>
-                <w:b w:val="0"/>
-                <w:color w:val="222222"/>
-                <w:sz w:val="18"/>
-              </w:rPr>
-              <w:t>etiqueta y y</w:t>
-            </w:r>
-          </w:p>
-        </w:tc>
-        <w:tc>
-          <w:tcPr>
-            <w:tcW w:type="dxa" w:w="6480"/>
-            <w:shd w:fill="F1F6FA"/>
-          </w:tcPr>
-          <w:p>
-            <w:pPr>
-              <w:spacing w:after="60" w:before="60"/>
-            </w:pPr>
-            <w:r>
-              <w:rPr>
-                <w:b w:val="0"/>
-                <w:color w:val="222222"/>
-                <w:sz w:val="18"/>
-              </w:rPr>
-              <w:t>Etiqueta original; y=1 si negative, y=0 en otro caso.</w:t>
+            <w:tcW w:type="dxa" w:w="2448"/>
+            <w:shd w:fill="F1F6FA"/>
+          </w:tcPr>
+          <w:p>
+            <w:pPr>
+              <w:spacing w:after="60" w:before="60"/>
+            </w:pPr>
+            <w:r>
+              <w:rPr>
+                <w:b w:val="0"/>
+                <w:color w:val="222222"/>
+                <w:sz w:val="18"/>
+              </w:rPr>
+              <w:t>etiqueta; y</w:t>
+            </w:r>
+          </w:p>
+        </w:tc>
+        <w:tc>
+          <w:tcPr>
+            <w:tcW w:type="dxa" w:w="6912"/>
+            <w:shd w:fill="F1F6FA"/>
+          </w:tcPr>
+          <w:p>
+            <w:pPr>
+              <w:spacing w:after="60" w:before="60"/>
+            </w:pPr>
+            <w:r>
+              <w:rPr>
+                <w:b w:val="0"/>
+                <w:color w:val="222222"/>
+                <w:sz w:val="18"/>
+              </w:rPr>
+              <w:t>Etiqueta original; y=1 para negative y 0 para neutral/positive.</w:t>
             </w:r>
           </w:p>
         </w:tc>
@@ -1584,39 +1654,39 @@
         </w:trPr>
         <w:tc>
           <w:tcPr>
-            <w:tcW w:type="dxa" w:w="2880"/>
-            <w:shd w:fill="F1F6FA"/>
-          </w:tcPr>
-          <w:p>
-            <w:pPr>
-              <w:spacing w:after="60" w:before="60"/>
-            </w:pPr>
-            <w:r>
-              <w:rPr>
-                <w:b w:val="0"/>
-                <w:color w:val="222222"/>
-                <w:sz w:val="18"/>
-              </w:rPr>
-              <w:t>split y n_caracteres</w:t>
-            </w:r>
-          </w:p>
-        </w:tc>
-        <w:tc>
-          <w:tcPr>
-            <w:tcW w:type="dxa" w:w="6480"/>
-            <w:shd w:fill="F1F6FA"/>
-          </w:tcPr>
-          <w:p>
-            <w:pPr>
-              <w:spacing w:after="60" w:before="60"/>
-            </w:pPr>
-            <w:r>
-              <w:rPr>
-                <w:b w:val="0"/>
-                <w:color w:val="222222"/>
-                <w:sz w:val="18"/>
-              </w:rPr>
-              <w:t>Partición histórica fija y longitud descriptiva; no son predictores.</w:t>
+            <w:tcW w:type="dxa" w:w="2448"/>
+            <w:shd w:fill="FFFFFF"/>
+          </w:tcPr>
+          <w:p>
+            <w:pPr>
+              <w:spacing w:after="60" w:before="60"/>
+            </w:pPr>
+            <w:r>
+              <w:rPr>
+                <w:b w:val="0"/>
+                <w:color w:val="222222"/>
+                <w:sz w:val="18"/>
+              </w:rPr>
+              <w:t>split; n_caracteres</w:t>
+            </w:r>
+          </w:p>
+        </w:tc>
+        <w:tc>
+          <w:tcPr>
+            <w:tcW w:type="dxa" w:w="6912"/>
+            <w:shd w:fill="FFFFFF"/>
+          </w:tcPr>
+          <w:p>
+            <w:pPr>
+              <w:spacing w:after="60" w:before="60"/>
+            </w:pPr>
+            <w:r>
+              <w:rPr>
+                <w:b w:val="0"/>
+                <w:color w:val="222222"/>
+                <w:sz w:val="18"/>
+              </w:rPr>
+              <w:t>Partición fija y longitud descriptiva; no son predictores.</w:t>
             </w:r>
           </w:p>
         </w:tc>
@@ -1627,39 +1697,39 @@
         </w:trPr>
         <w:tc>
           <w:tcPr>
-            <w:tcW w:type="dxa" w:w="2880"/>
-            <w:shd w:fill="F1F6FA"/>
-          </w:tcPr>
-          <w:p>
-            <w:pPr>
-              <w:spacing w:after="60" w:before="60"/>
-            </w:pPr>
-            <w:r>
-              <w:rPr>
-                <w:b w:val="0"/>
-                <w:color w:val="222222"/>
-                <w:sz w:val="18"/>
-              </w:rPr>
-              <w:t>cliente_id y perfil_riesgo</w:t>
-            </w:r>
-          </w:p>
-        </w:tc>
-        <w:tc>
-          <w:tcPr>
-            <w:tcW w:type="dxa" w:w="6480"/>
-            <w:shd w:fill="F1F6FA"/>
-          </w:tcPr>
-          <w:p>
-            <w:pPr>
-              <w:spacing w:after="60" w:before="60"/>
-            </w:pPr>
-            <w:r>
-              <w:rPr>
-                <w:b w:val="0"/>
-                <w:color w:val="222222"/>
-                <w:sz w:val="18"/>
-              </w:rPr>
-              <w:t>Sólo contexto simulado y estratos de asignación A/B.</w:t>
+            <w:tcW w:type="dxa" w:w="2448"/>
+            <w:shd w:fill="F1F6FA"/>
+          </w:tcPr>
+          <w:p>
+            <w:pPr>
+              <w:spacing w:after="60" w:before="60"/>
+            </w:pPr>
+            <w:r>
+              <w:rPr>
+                <w:b w:val="0"/>
+                <w:color w:val="222222"/>
+                <w:sz w:val="18"/>
+              </w:rPr>
+              <w:t>cliente_id; perfil_riesgo</w:t>
+            </w:r>
+          </w:p>
+        </w:tc>
+        <w:tc>
+          <w:tcPr>
+            <w:tcW w:type="dxa" w:w="6912"/>
+            <w:shd w:fill="F1F6FA"/>
+          </w:tcPr>
+          <w:p>
+            <w:pPr>
+              <w:spacing w:after="60" w:before="60"/>
+            </w:pPr>
+            <w:r>
+              <w:rPr>
+                <w:b w:val="0"/>
+                <w:color w:val="222222"/>
+                <w:sz w:val="18"/>
+              </w:rPr>
+              <w:t>Identidad ficticia y estrato A/B; sólo contexto simulado.</w:t>
             </w:r>
           </w:p>
         </w:tc>
@@ -1667,27 +1737,35 @@
     </w:tbl>
     <w:p>
       <w:r>
-        <w:t>La limpieza heredada elimina duplicados antes de separar; no hay textos vacíos ni etiquetas faltantes. No imputo ni traduzco. TF-IDF aprende vocabulario e IDF dentro de cada entrenamiento, con unigramas y bigramas, norma L2 y hasta 25,000 términos. No aplico escalado numérico adicional ni uso información del test en esa transformación.</w:t>
-      </w:r>
-    </w:p>
-    <w:p>
-      <w:r>
-        <w:t>Comparo regresión logística (C=1, solver liblinear) y LinearSVC (C=1) con calibración sigmoide de tres folds. El pipeline TF-IDF completo se encuentra dentro de la calibración, evitando que su vocabulario vea el fold de calibración. Estos hiperparámetros se fijan para esta actividad; no presento una nueva búsqueda exhaustiva.</w:t>
-      </w:r>
-    </w:p>
-    <w:p>
-      <w:r>
-        <w:t>Uso cinco folds externos estratificados con semilla 20261022. En cada entrenamiento externo, tres folds internos generan probabilidades fuera de muestra para elegir umbral; después evalúo en su fold externo. La rejilla va de 0.05 a 0.95, en pasos de 0.025. Si no existe umbral que cumpla recall y precisión, elijo el menor costo 5FN+FP y marco la inviabilidad. El modelo se selecciona por costo medio externo; el umbral final se fija con cinco folds de desarrollo y se aplica al test histórico.</w:t>
-      </w:r>
-    </w:p>
-    <w:p>
-      <w:r>
-        <w:t>La selección entre dos modelos sobre esos mismos folds puede introducir optimismo; los folds no son muestras independientes. El bootstrap del test cuantifica incertidumbre condicional al corpus y al modelo ya ajustado, no deriva temporal ni incertidumbre completa de entrenamiento. Hace falta una evaluación prospectiva con noticias en español, separación temporal y agrupación por emisor o evento.</w:t>
-      </w:r>
-    </w:p>
-    <w:p>
-      <w:r>
-        <w:t>Cada ejecución registra hash de datos y código, semilla, parámetros, métricas y artefactos en MLflow. El repositorio conserva IDs de corrida, predicciones y folds. Se incluyen originales, licencia, versión limpia y manifiesto; el historial documenta el cambio de solver después de advertencias numéricas exploratorias.</w:t>
+        <w:t>TF-IDF utiliza unigramas y bigramas, frecuencia sublineal, norma L2 y máximo 25,000 términos. Aprende vocabulario e IDF exclusivamente dentro del entrenamiento; no requiere escalado adicional. Comparo logística C=1, solver liblinear, y LinearSVC C=1 calibrada con sigmoide en tres folds. El pipeline completo queda dentro de la calibración para evitar fuga de vocabulario (Pedregosa et al., 2011).</w:t>
+      </w:r>
+    </w:p>
+    <w:p>
+      <w:r>
+        <w:t>Uso cinco folds externos estratificados, semilla 20261022. En cada entrenamiento externo, tres folds internos generan probabilidades fuera de muestra (OOF) para elegir umbral. Evalúo después en el fold externo. Rejilla: 0.05–0.95, paso 0.025. Entre umbrales factibles minimizo 5FN+FP; si ninguno cumple recall y precisión, minimizo ese costo y registro la inviabilidad. El modelo se elige por costo medio externo. El umbral final se fija con cinco folds OOF de desarrollo, sin optimizar en test.</w:t>
+      </w:r>
+    </w:p>
+    <w:p>
+      <w:r>
+        <w:t>La selección entre modelos usando esos folds puede inducir optimismo y los folds no son independientes. No uso una prueba t ingenua sobre ellos. El bootstrap condiciona al corpus y al modelo ajustado; no captura deriva ni toda la incertidumbre del entrenamiento. La siguiente validación debe ser temporal, en español y agrupada por emisor o evento.</w:t>
+      </w:r>
+    </w:p>
+    <w:p>
+      <w:pPr>
+        <w:pStyle w:val="Ttulo1"/>
+      </w:pPr>
+      <w:r>
+        <w:t>Trazabilidad y condiciones de ejecución</w:t>
+      </w:r>
+    </w:p>
+    <w:p>
+      <w:r>
+        <w:t>MLflow guarda parámetros, métricas, semillas, hashes y artefactos, no un servicio productivo ni un registro con aprobaciones. Conservo corridas exploratorias y definitivas. El cambio previo de solver por advertencias numéricas está documentado. El código original sigue intacto; las ampliaciones se calculan aparte (MLflow, s. f.).</w:t>
+      </w:r>
+    </w:p>
+    <w:p>
+      <w:r>
+        <w:t>La reproducción local comprobada usa macOS ARM, Python 3.12.14, scikit-learn 1.6.1 y MLflow 2.22.2; SQLAlchemy 2.0.40 evita una incompatibilidad de instalación. El SHA-256 del experimento es 4084da16ebe2f67af618f78beab450d040aa968c418ce7d37e759fbe9d95a32f. La auditoría externa comunicada por el autor refiere Linux con otras versiones; sin sus logs no la presento como verificación propia.</w:t>
       </w:r>
     </w:p>
     <w:p>
@@ -1700,14 +1778,17 @@
         <w:pStyle w:val="Ttulo1"/>
       </w:pPr>
       <w:r>
-        <w:t>Matriz de confusión y métricas</w:t>
-      </w:r>
-    </w:p>
-    <w:p>
+        <w:t>Matriz de confusión y escenarios de umbral</w:t>
+      </w:r>
+    </w:p>
+    <w:p>
+      <w:pPr>
+        <w:keepNext/>
+      </w:pPr>
       <w:r>
         <w:drawing>
           <wp:inline xmlns:a="http://schemas.openxmlformats.org/drawingml/2006/main" xmlns:pic="http://schemas.openxmlformats.org/drawingml/2006/picture">
-            <wp:extent cx="5669280" cy="2204720"/>
+            <wp:extent cx="5577840" cy="2169160"/>
             <wp:docPr id="6" name="Picture 6"/>
             <wp:cNvGraphicFramePr>
               <a:graphicFrameLocks noChangeAspect="1"/>
@@ -1716,7 +1797,7 @@
               <a:graphicData uri="http://schemas.openxmlformats.org/drawingml/2006/picture">
                 <pic:pic>
                   <pic:nvPicPr>
-                    <pic:cNvPr id="0" name="confusion.png"/>
+                    <pic:cNvPr id="0" name="image.png"/>
                     <pic:cNvPicPr/>
                   </pic:nvPicPr>
                   <pic:blipFill>
@@ -1728,7 +1809,7 @@
                   <pic:spPr>
                     <a:xfrm>
                       <a:off x="0" y="0"/>
-                      <a:ext cx="5669280" cy="2204720"/>
+                      <a:ext cx="5577840" cy="2169160"/>
                     </a:xfrm>
                     <a:prstGeom prst="rect"/>
                   </pic:spPr>
@@ -1740,8 +1821,32 @@
       </w:r>
     </w:p>
     <w:p>
-      <w:r>
-        <w:t>En el umbral elegido: verdaderos positivos (TP)=51, falsos negativos (FN)=10, falsos positivos (FP)=25 y verdaderos negativos (TN)=366. Un falso negativo deja una noticia adversa sin priorizar; un falso positivo consume revisión del banquero. Ninguno equivale automáticamente a una ganancia o pérdida financiera.</w:t>
+      <w:pPr>
+        <w:keepNext/>
+      </w:pPr>
+      <w:r>
+        <w:rPr>
+          <w:i/>
+          <w:sz w:val="18"/>
+        </w:rPr>
+        <w:t>Figura 1. Matriz de confusión de la SVM calibrada en los umbrales 0.50 y 0.20.</w:t>
+      </w:r>
+    </w:p>
+    <w:p>
+      <w:r>
+        <w:t>En la Figura 1, TP=51, FN=10, FP=25 y TN=366 para 0.20. Un FN deja una noticia adversa sin priorizar; un FP consume tiempo del banquero. No equivalen por sí mismos a ganancias o pérdidas financieras.</w:t>
+      </w:r>
+    </w:p>
+    <w:p>
+      <w:pPr>
+        <w:keepNext/>
+      </w:pPr>
+      <w:r>
+        <w:rPr>
+          <w:i/>
+          <w:sz w:val="18"/>
+        </w:rPr>
+        <w:t>Tabla 3. Métricas de SVM 0.20 y propósito</w:t>
       </w:r>
     </w:p>
     <w:tbl>
@@ -1781,7 +1886,7 @@
         </w:tc>
         <w:tc>
           <w:tcPr>
-            <w:tcW w:type="dxa" w:w="3744"/>
+            <w:tcW w:type="dxa" w:w="2880"/>
             <w:shd w:fill="004481"/>
           </w:tcPr>
           <w:p>
@@ -1794,13 +1899,13 @@
                 <w:color w:val="FFFFFF"/>
                 <w:sz w:val="18"/>
               </w:rPr>
-              <w:t>Cálculo para SVM con umbral 0.20</w:t>
-            </w:r>
-          </w:p>
-        </w:tc>
-        <w:tc>
-          <w:tcPr>
-            <w:tcW w:type="dxa" w:w="4176"/>
+              <w:t>Cálculo</w:t>
+            </w:r>
+          </w:p>
+        </w:tc>
+        <w:tc>
+          <w:tcPr>
+            <w:tcW w:type="dxa" w:w="5040"/>
             <w:shd w:fill="004481"/>
           </w:tcPr>
           <w:p>
@@ -1813,7 +1918,7 @@
                 <w:color w:val="FFFFFF"/>
                 <w:sz w:val="18"/>
               </w:rPr>
-              <w:t>Interpretación</w:t>
+              <w:t>Uso en la revisión</w:t>
             </w:r>
           </w:p>
         </w:tc>
@@ -1837,13 +1942,13 @@
                 <w:color w:val="222222"/>
                 <w:sz w:val="18"/>
               </w:rPr>
-              <w:t>Exactitud</w:t>
-            </w:r>
-          </w:p>
-        </w:tc>
-        <w:tc>
-          <w:tcPr>
-            <w:tcW w:type="dxa" w:w="3744"/>
+              <w:t>Accuracy</w:t>
+            </w:r>
+          </w:p>
+        </w:tc>
+        <w:tc>
+          <w:tcPr>
+            <w:tcW w:type="dxa" w:w="2880"/>
             <w:shd w:fill="F1F6FA"/>
           </w:tcPr>
           <w:p>
@@ -1862,20 +1967,20 @@
         </w:tc>
         <w:tc>
           <w:tcPr>
-            <w:tcW w:type="dxa" w:w="4176"/>
-            <w:shd w:fill="F1F6FA"/>
-          </w:tcPr>
-          <w:p>
-            <w:pPr>
-              <w:spacing w:after="60" w:before="60"/>
-            </w:pPr>
-            <w:r>
-              <w:rPr>
-                <w:b w:val="0"/>
-                <w:color w:val="222222"/>
-                <w:sz w:val="18"/>
-              </w:rPr>
-              <w:t>Proporción total correcta; la clase mayoritaria puede inflarla.</w:t>
+            <w:tcW w:type="dxa" w:w="5040"/>
+            <w:shd w:fill="F1F6FA"/>
+          </w:tcPr>
+          <w:p>
+            <w:pPr>
+              <w:spacing w:after="60" w:before="60"/>
+            </w:pPr>
+            <w:r>
+              <w:rPr>
+                <w:b w:val="0"/>
+                <w:color w:val="222222"/>
+                <w:sz w:val="18"/>
+              </w:rPr>
+              <w:t>Control global; puede ocultar desbalance.</w:t>
             </w:r>
           </w:p>
         </w:tc>
@@ -1887,7 +1992,7 @@
         <w:tc>
           <w:tcPr>
             <w:tcW w:type="dxa" w:w="1440"/>
-            <w:shd w:fill="F1F6FA"/>
+            <w:shd w:fill="FFFFFF"/>
           </w:tcPr>
           <w:p>
             <w:pPr>
@@ -1905,39 +2010,39 @@
         </w:tc>
         <w:tc>
           <w:tcPr>
-            <w:tcW w:type="dxa" w:w="3744"/>
-            <w:shd w:fill="F1F6FA"/>
-          </w:tcPr>
-          <w:p>
-            <w:pPr>
-              <w:spacing w:after="60" w:before="60"/>
-            </w:pPr>
-            <w:r>
-              <w:rPr>
-                <w:b w:val="0"/>
-                <w:color w:val="222222"/>
-                <w:sz w:val="18"/>
-              </w:rPr>
-              <w:t>51/(51+25) = 0.6711</w:t>
-            </w:r>
-          </w:p>
-        </w:tc>
-        <w:tc>
-          <w:tcPr>
-            <w:tcW w:type="dxa" w:w="4176"/>
-            <w:shd w:fill="F1F6FA"/>
-          </w:tcPr>
-          <w:p>
-            <w:pPr>
-              <w:spacing w:after="60" w:before="60"/>
-            </w:pPr>
-            <w:r>
-              <w:rPr>
-                <w:b w:val="0"/>
-                <w:color w:val="222222"/>
-                <w:sz w:val="18"/>
-              </w:rPr>
-              <w:t>Cerca de dos de cada tres alertas son negativas.</w:t>
+            <w:tcW w:type="dxa" w:w="2880"/>
+            <w:shd w:fill="FFFFFF"/>
+          </w:tcPr>
+          <w:p>
+            <w:pPr>
+              <w:spacing w:after="60" w:before="60"/>
+            </w:pPr>
+            <w:r>
+              <w:rPr>
+                <w:b w:val="0"/>
+                <w:color w:val="222222"/>
+                <w:sz w:val="18"/>
+              </w:rPr>
+              <w:t>51/76 = 0.6711</w:t>
+            </w:r>
+          </w:p>
+        </w:tc>
+        <w:tc>
+          <w:tcPr>
+            <w:tcW w:type="dxa" w:w="5040"/>
+            <w:shd w:fill="FFFFFF"/>
+          </w:tcPr>
+          <w:p>
+            <w:pPr>
+              <w:spacing w:after="60" w:before="60"/>
+            </w:pPr>
+            <w:r>
+              <w:rPr>
+                <w:b w:val="0"/>
+                <w:color w:val="222222"/>
+                <w:sz w:val="18"/>
+              </w:rPr>
+              <w:t>Proporción útil de alertas y carga operativa.</w:t>
             </w:r>
           </w:p>
         </w:tc>
@@ -1967,39 +2072,39 @@
         </w:tc>
         <w:tc>
           <w:tcPr>
-            <w:tcW w:type="dxa" w:w="3744"/>
-            <w:shd w:fill="F1F6FA"/>
-          </w:tcPr>
-          <w:p>
-            <w:pPr>
-              <w:spacing w:after="60" w:before="60"/>
-            </w:pPr>
-            <w:r>
-              <w:rPr>
-                <w:b w:val="0"/>
-                <w:color w:val="222222"/>
-                <w:sz w:val="18"/>
-              </w:rPr>
-              <w:t>51/(51+10) = 0.8361</w:t>
-            </w:r>
-          </w:p>
-        </w:tc>
-        <w:tc>
-          <w:tcPr>
-            <w:tcW w:type="dxa" w:w="4176"/>
-            <w:shd w:fill="F1F6FA"/>
-          </w:tcPr>
-          <w:p>
-            <w:pPr>
-              <w:spacing w:after="60" w:before="60"/>
-            </w:pPr>
-            <w:r>
-              <w:rPr>
-                <w:b w:val="0"/>
-                <w:color w:val="222222"/>
-                <w:sz w:val="18"/>
-              </w:rPr>
-              <w:t>Detecta 83.6 % de las noticias negativas.</w:t>
+            <w:tcW w:type="dxa" w:w="2880"/>
+            <w:shd w:fill="F1F6FA"/>
+          </w:tcPr>
+          <w:p>
+            <w:pPr>
+              <w:spacing w:after="60" w:before="60"/>
+            </w:pPr>
+            <w:r>
+              <w:rPr>
+                <w:b w:val="0"/>
+                <w:color w:val="222222"/>
+                <w:sz w:val="18"/>
+              </w:rPr>
+              <w:t>51/61 = 0.8361</w:t>
+            </w:r>
+          </w:p>
+        </w:tc>
+        <w:tc>
+          <w:tcPr>
+            <w:tcW w:type="dxa" w:w="5040"/>
+            <w:shd w:fill="F1F6FA"/>
+          </w:tcPr>
+          <w:p>
+            <w:pPr>
+              <w:spacing w:after="60" w:before="60"/>
+            </w:pPr>
+            <w:r>
+              <w:rPr>
+                <w:b w:val="0"/>
+                <w:color w:val="222222"/>
+                <w:sz w:val="18"/>
+              </w:rPr>
+              <w:t>Cobertura de noticias negativas.</w:t>
             </w:r>
           </w:p>
         </w:tc>
@@ -2011,7 +2116,7 @@
         <w:tc>
           <w:tcPr>
             <w:tcW w:type="dxa" w:w="1440"/>
-            <w:shd w:fill="F1F6FA"/>
+            <w:shd w:fill="FFFFFF"/>
           </w:tcPr>
           <w:p>
             <w:pPr>
@@ -2029,52 +2134,705 @@
         </w:tc>
         <w:tc>
           <w:tcPr>
-            <w:tcW w:type="dxa" w:w="3744"/>
-            <w:shd w:fill="F1F6FA"/>
-          </w:tcPr>
-          <w:p>
-            <w:pPr>
-              <w:spacing w:after="60" w:before="60"/>
-            </w:pPr>
-            <w:r>
-              <w:rPr>
-                <w:b w:val="0"/>
-                <w:color w:val="222222"/>
-                <w:sz w:val="18"/>
-              </w:rPr>
-              <w:t>2×51/(2×51+25+10) = 0.7445</w:t>
-            </w:r>
-          </w:p>
-        </w:tc>
-        <w:tc>
-          <w:tcPr>
-            <w:tcW w:type="dxa" w:w="4176"/>
-            <w:shd w:fill="F1F6FA"/>
-          </w:tcPr>
-          <w:p>
-            <w:pPr>
-              <w:spacing w:after="60" w:before="60"/>
-            </w:pPr>
-            <w:r>
-              <w:rPr>
-                <w:b w:val="0"/>
-                <w:color w:val="222222"/>
-                <w:sz w:val="18"/>
-              </w:rPr>
-              <w:t>Equilibra precisión y recall; no refleja por sí solo costos.</w:t>
+            <w:tcW w:type="dxa" w:w="2880"/>
+            <w:shd w:fill="FFFFFF"/>
+          </w:tcPr>
+          <w:p>
+            <w:pPr>
+              <w:spacing w:after="60" w:before="60"/>
+            </w:pPr>
+            <w:r>
+              <w:rPr>
+                <w:b w:val="0"/>
+                <w:color w:val="222222"/>
+                <w:sz w:val="18"/>
+              </w:rPr>
+              <w:t>102/137 = 0.7445</w:t>
+            </w:r>
+          </w:p>
+        </w:tc>
+        <w:tc>
+          <w:tcPr>
+            <w:tcW w:type="dxa" w:w="5040"/>
+            <w:shd w:fill="FFFFFF"/>
+          </w:tcPr>
+          <w:p>
+            <w:pPr>
+              <w:spacing w:after="60" w:before="60"/>
+            </w:pPr>
+            <w:r>
+              <w:rPr>
+                <w:b w:val="0"/>
+                <w:color w:val="222222"/>
+                <w:sz w:val="18"/>
+              </w:rPr>
+              <w:t>Balance de precisión y recall; no mide costos.</w:t>
             </w:r>
           </w:p>
         </w:tc>
       </w:tr>
     </w:tbl>
     <w:p>
-      <w:r>
-        <w:t>El baseline mayoritario logra 86.5 % de exactitud pero recall y F1 iguales a cero. Revisar todo logra recall de 100 %, precisión de 13.5 % y F1 de 23.8 %. Ambas referencias muestran por qué la exactitud aislada no basta: necesito recuperar señales útiles sin revisar todas las noticias.</w:t>
-      </w:r>
-    </w:p>
-    <w:p>
-      <w:r>
-        <w:t>Al bajar de 0.50 a 0.20, las omisiones pasan de 21 a 10, pero las falsas alertas suben de 7 a 25. La carga crece de 47 a 76 revisiones entre 452 noticias. El costo ponderado disminuye de 24.78 a 16.59 unidades por cada 100 noticias. Es una preferencia operativa explícita, no una estimación de pesos perdidos o ahorrados.</w:t>
+      <w:pPr>
+        <w:keepNext/>
+      </w:pPr>
+      <w:r>
+        <w:rPr>
+          <w:i/>
+          <w:sz w:val="18"/>
+        </w:rPr>
+        <w:t>Tabla 4. Escenarios sobre el test histórico sin reseleccionar el umbral</w:t>
+      </w:r>
+    </w:p>
+    <w:tbl>
+      <w:tblPr>
+        <w:tblW w:type="auto" w:w="0"/>
+        <w:tblLayout w:type="fixed"/>
+        <w:tblLook w:firstColumn="1" w:firstRow="1" w:lastColumn="0" w:lastRow="0" w:noHBand="0" w:noVBand="1" w:val="04A0"/>
+      </w:tblPr>
+      <w:tblGrid>
+        <w:gridCol w:w="1170"/>
+        <w:gridCol w:w="1170"/>
+        <w:gridCol w:w="1170"/>
+        <w:gridCol w:w="1170"/>
+        <w:gridCol w:w="1170"/>
+        <w:gridCol w:w="1170"/>
+        <w:gridCol w:w="1170"/>
+        <w:gridCol w:w="1170"/>
+      </w:tblGrid>
+      <w:tr>
+        <w:trPr>
+          <w:cantSplit/>
+          <w:tblHeader/>
+        </w:trPr>
+        <w:tc>
+          <w:tcPr>
+            <w:tcW w:type="dxa" w:w="1152"/>
+            <w:shd w:fill="004481"/>
+          </w:tcPr>
+          <w:p>
+            <w:pPr>
+              <w:spacing w:after="60" w:before="60"/>
+            </w:pPr>
+            <w:r>
+              <w:rPr>
+                <w:b/>
+                <w:color w:val="FFFFFF"/>
+                <w:sz w:val="18"/>
+              </w:rPr>
+              <w:t>Umbral</w:t>
+            </w:r>
+          </w:p>
+        </w:tc>
+        <w:tc>
+          <w:tcPr>
+            <w:tcW w:type="dxa" w:w="1224"/>
+            <w:shd w:fill="004481"/>
+          </w:tcPr>
+          <w:p>
+            <w:pPr>
+              <w:spacing w:after="60" w:before="60"/>
+            </w:pPr>
+            <w:r>
+              <w:rPr>
+                <w:b/>
+                <w:color w:val="FFFFFF"/>
+                <w:sz w:val="18"/>
+              </w:rPr>
+              <w:t>Recall</w:t>
+            </w:r>
+          </w:p>
+        </w:tc>
+        <w:tc>
+          <w:tcPr>
+            <w:tcW w:type="dxa" w:w="1224"/>
+            <w:shd w:fill="004481"/>
+          </w:tcPr>
+          <w:p>
+            <w:pPr>
+              <w:spacing w:after="60" w:before="60"/>
+            </w:pPr>
+            <w:r>
+              <w:rPr>
+                <w:b/>
+                <w:color w:val="FFFFFF"/>
+                <w:sz w:val="18"/>
+              </w:rPr>
+              <w:t>Prec.</w:t>
+            </w:r>
+          </w:p>
+        </w:tc>
+        <w:tc>
+          <w:tcPr>
+            <w:tcW w:type="dxa" w:w="1224"/>
+            <w:shd w:fill="004481"/>
+          </w:tcPr>
+          <w:p>
+            <w:pPr>
+              <w:spacing w:after="60" w:before="60"/>
+            </w:pPr>
+            <w:r>
+              <w:rPr>
+                <w:b/>
+                <w:color w:val="FFFFFF"/>
+                <w:sz w:val="18"/>
+              </w:rPr>
+              <w:t>F1</w:t>
+            </w:r>
+          </w:p>
+        </w:tc>
+        <w:tc>
+          <w:tcPr>
+            <w:tcW w:type="dxa" w:w="720"/>
+            <w:shd w:fill="004481"/>
+          </w:tcPr>
+          <w:p>
+            <w:pPr>
+              <w:spacing w:after="60" w:before="60"/>
+            </w:pPr>
+            <w:r>
+              <w:rPr>
+                <w:b/>
+                <w:color w:val="FFFFFF"/>
+                <w:sz w:val="18"/>
+              </w:rPr>
+              <w:t>FN</w:t>
+            </w:r>
+          </w:p>
+        </w:tc>
+        <w:tc>
+          <w:tcPr>
+            <w:tcW w:type="dxa" w:w="720"/>
+            <w:shd w:fill="004481"/>
+          </w:tcPr>
+          <w:p>
+            <w:pPr>
+              <w:spacing w:after="60" w:before="60"/>
+            </w:pPr>
+            <w:r>
+              <w:rPr>
+                <w:b/>
+                <w:color w:val="FFFFFF"/>
+                <w:sz w:val="18"/>
+              </w:rPr>
+              <w:t>FP</w:t>
+            </w:r>
+          </w:p>
+        </w:tc>
+        <w:tc>
+          <w:tcPr>
+            <w:tcW w:type="dxa" w:w="936"/>
+            <w:shd w:fill="004481"/>
+          </w:tcPr>
+          <w:p>
+            <w:pPr>
+              <w:spacing w:after="60" w:before="60"/>
+            </w:pPr>
+            <w:r>
+              <w:rPr>
+                <w:b/>
+                <w:color w:val="FFFFFF"/>
+                <w:sz w:val="18"/>
+              </w:rPr>
+              <w:t>Rev.</w:t>
+            </w:r>
+          </w:p>
+        </w:tc>
+        <w:tc>
+          <w:tcPr>
+            <w:tcW w:type="dxa" w:w="1512"/>
+            <w:shd w:fill="004481"/>
+          </w:tcPr>
+          <w:p>
+            <w:pPr>
+              <w:spacing w:after="60" w:before="60"/>
+            </w:pPr>
+            <w:r>
+              <w:rPr>
+                <w:b/>
+                <w:color w:val="FFFFFF"/>
+                <w:sz w:val="18"/>
+              </w:rPr>
+              <w:t>Costo/100</w:t>
+            </w:r>
+          </w:p>
+        </w:tc>
+      </w:tr>
+      <w:tr>
+        <w:trPr>
+          <w:cantSplit/>
+        </w:trPr>
+        <w:tc>
+          <w:tcPr>
+            <w:tcW w:type="dxa" w:w="1152"/>
+            <w:shd w:fill="F1F6FA"/>
+          </w:tcPr>
+          <w:p>
+            <w:pPr>
+              <w:spacing w:after="60" w:before="60"/>
+            </w:pPr>
+            <w:r>
+              <w:rPr>
+                <w:b w:val="0"/>
+                <w:color w:val="222222"/>
+                <w:sz w:val="18"/>
+              </w:rPr>
+              <w:t>0.075</w:t>
+            </w:r>
+          </w:p>
+        </w:tc>
+        <w:tc>
+          <w:tcPr>
+            <w:tcW w:type="dxa" w:w="1224"/>
+            <w:shd w:fill="F1F6FA"/>
+          </w:tcPr>
+          <w:p>
+            <w:pPr>
+              <w:spacing w:after="60" w:before="60"/>
+            </w:pPr>
+            <w:r>
+              <w:rPr>
+                <w:b w:val="0"/>
+                <w:color w:val="222222"/>
+                <w:sz w:val="18"/>
+              </w:rPr>
+              <w:t>0.9016</w:t>
+            </w:r>
+          </w:p>
+        </w:tc>
+        <w:tc>
+          <w:tcPr>
+            <w:tcW w:type="dxa" w:w="1224"/>
+            <w:shd w:fill="F1F6FA"/>
+          </w:tcPr>
+          <w:p>
+            <w:pPr>
+              <w:spacing w:after="60" w:before="60"/>
+            </w:pPr>
+            <w:r>
+              <w:rPr>
+                <w:b w:val="0"/>
+                <w:color w:val="222222"/>
+                <w:sz w:val="18"/>
+              </w:rPr>
+              <w:t>0.4435</w:t>
+            </w:r>
+          </w:p>
+        </w:tc>
+        <w:tc>
+          <w:tcPr>
+            <w:tcW w:type="dxa" w:w="1224"/>
+            <w:shd w:fill="F1F6FA"/>
+          </w:tcPr>
+          <w:p>
+            <w:pPr>
+              <w:spacing w:after="60" w:before="60"/>
+            </w:pPr>
+            <w:r>
+              <w:rPr>
+                <w:b w:val="0"/>
+                <w:color w:val="222222"/>
+                <w:sz w:val="18"/>
+              </w:rPr>
+              <w:t>0.5946</w:t>
+            </w:r>
+          </w:p>
+        </w:tc>
+        <w:tc>
+          <w:tcPr>
+            <w:tcW w:type="dxa" w:w="720"/>
+            <w:shd w:fill="F1F6FA"/>
+          </w:tcPr>
+          <w:p>
+            <w:pPr>
+              <w:spacing w:after="60" w:before="60"/>
+            </w:pPr>
+            <w:r>
+              <w:rPr>
+                <w:b w:val="0"/>
+                <w:color w:val="222222"/>
+                <w:sz w:val="18"/>
+              </w:rPr>
+              <w:t>6</w:t>
+            </w:r>
+          </w:p>
+        </w:tc>
+        <w:tc>
+          <w:tcPr>
+            <w:tcW w:type="dxa" w:w="720"/>
+            <w:shd w:fill="F1F6FA"/>
+          </w:tcPr>
+          <w:p>
+            <w:pPr>
+              <w:spacing w:after="60" w:before="60"/>
+            </w:pPr>
+            <w:r>
+              <w:rPr>
+                <w:b w:val="0"/>
+                <w:color w:val="222222"/>
+                <w:sz w:val="18"/>
+              </w:rPr>
+              <w:t>69</w:t>
+            </w:r>
+          </w:p>
+        </w:tc>
+        <w:tc>
+          <w:tcPr>
+            <w:tcW w:type="dxa" w:w="936"/>
+            <w:shd w:fill="F1F6FA"/>
+          </w:tcPr>
+          <w:p>
+            <w:pPr>
+              <w:spacing w:after="60" w:before="60"/>
+            </w:pPr>
+            <w:r>
+              <w:rPr>
+                <w:b w:val="0"/>
+                <w:color w:val="222222"/>
+                <w:sz w:val="18"/>
+              </w:rPr>
+              <w:t>124</w:t>
+            </w:r>
+          </w:p>
+        </w:tc>
+        <w:tc>
+          <w:tcPr>
+            <w:tcW w:type="dxa" w:w="1512"/>
+            <w:shd w:fill="F1F6FA"/>
+          </w:tcPr>
+          <w:p>
+            <w:pPr>
+              <w:spacing w:after="60" w:before="60"/>
+            </w:pPr>
+            <w:r>
+              <w:rPr>
+                <w:b w:val="0"/>
+                <w:color w:val="222222"/>
+                <w:sz w:val="18"/>
+              </w:rPr>
+              <w:t>21.90</w:t>
+            </w:r>
+          </w:p>
+        </w:tc>
+      </w:tr>
+      <w:tr>
+        <w:trPr>
+          <w:cantSplit/>
+        </w:trPr>
+        <w:tc>
+          <w:tcPr>
+            <w:tcW w:type="dxa" w:w="1152"/>
+            <w:shd w:fill="FFFFFF"/>
+          </w:tcPr>
+          <w:p>
+            <w:pPr>
+              <w:spacing w:after="60" w:before="60"/>
+            </w:pPr>
+            <w:r>
+              <w:rPr>
+                <w:b w:val="0"/>
+                <w:color w:val="222222"/>
+                <w:sz w:val="18"/>
+              </w:rPr>
+              <w:t>0.20</w:t>
+            </w:r>
+          </w:p>
+        </w:tc>
+        <w:tc>
+          <w:tcPr>
+            <w:tcW w:type="dxa" w:w="1224"/>
+            <w:shd w:fill="FFFFFF"/>
+          </w:tcPr>
+          <w:p>
+            <w:pPr>
+              <w:spacing w:after="60" w:before="60"/>
+            </w:pPr>
+            <w:r>
+              <w:rPr>
+                <w:b w:val="0"/>
+                <w:color w:val="222222"/>
+                <w:sz w:val="18"/>
+              </w:rPr>
+              <w:t>0.8361</w:t>
+            </w:r>
+          </w:p>
+        </w:tc>
+        <w:tc>
+          <w:tcPr>
+            <w:tcW w:type="dxa" w:w="1224"/>
+            <w:shd w:fill="FFFFFF"/>
+          </w:tcPr>
+          <w:p>
+            <w:pPr>
+              <w:spacing w:after="60" w:before="60"/>
+            </w:pPr>
+            <w:r>
+              <w:rPr>
+                <w:b w:val="0"/>
+                <w:color w:val="222222"/>
+                <w:sz w:val="18"/>
+              </w:rPr>
+              <w:t>0.6711</w:t>
+            </w:r>
+          </w:p>
+        </w:tc>
+        <w:tc>
+          <w:tcPr>
+            <w:tcW w:type="dxa" w:w="1224"/>
+            <w:shd w:fill="FFFFFF"/>
+          </w:tcPr>
+          <w:p>
+            <w:pPr>
+              <w:spacing w:after="60" w:before="60"/>
+            </w:pPr>
+            <w:r>
+              <w:rPr>
+                <w:b w:val="0"/>
+                <w:color w:val="222222"/>
+                <w:sz w:val="18"/>
+              </w:rPr>
+              <w:t>0.7445</w:t>
+            </w:r>
+          </w:p>
+        </w:tc>
+        <w:tc>
+          <w:tcPr>
+            <w:tcW w:type="dxa" w:w="720"/>
+            <w:shd w:fill="FFFFFF"/>
+          </w:tcPr>
+          <w:p>
+            <w:pPr>
+              <w:spacing w:after="60" w:before="60"/>
+            </w:pPr>
+            <w:r>
+              <w:rPr>
+                <w:b w:val="0"/>
+                <w:color w:val="222222"/>
+                <w:sz w:val="18"/>
+              </w:rPr>
+              <w:t>10</w:t>
+            </w:r>
+          </w:p>
+        </w:tc>
+        <w:tc>
+          <w:tcPr>
+            <w:tcW w:type="dxa" w:w="720"/>
+            <w:shd w:fill="FFFFFF"/>
+          </w:tcPr>
+          <w:p>
+            <w:pPr>
+              <w:spacing w:after="60" w:before="60"/>
+            </w:pPr>
+            <w:r>
+              <w:rPr>
+                <w:b w:val="0"/>
+                <w:color w:val="222222"/>
+                <w:sz w:val="18"/>
+              </w:rPr>
+              <w:t>25</w:t>
+            </w:r>
+          </w:p>
+        </w:tc>
+        <w:tc>
+          <w:tcPr>
+            <w:tcW w:type="dxa" w:w="936"/>
+            <w:shd w:fill="FFFFFF"/>
+          </w:tcPr>
+          <w:p>
+            <w:pPr>
+              <w:spacing w:after="60" w:before="60"/>
+            </w:pPr>
+            <w:r>
+              <w:rPr>
+                <w:b w:val="0"/>
+                <w:color w:val="222222"/>
+                <w:sz w:val="18"/>
+              </w:rPr>
+              <w:t>76</w:t>
+            </w:r>
+          </w:p>
+        </w:tc>
+        <w:tc>
+          <w:tcPr>
+            <w:tcW w:type="dxa" w:w="1512"/>
+            <w:shd w:fill="FFFFFF"/>
+          </w:tcPr>
+          <w:p>
+            <w:pPr>
+              <w:spacing w:after="60" w:before="60"/>
+            </w:pPr>
+            <w:r>
+              <w:rPr>
+                <w:b w:val="0"/>
+                <w:color w:val="222222"/>
+                <w:sz w:val="18"/>
+              </w:rPr>
+              <w:t>16.59</w:t>
+            </w:r>
+          </w:p>
+        </w:tc>
+      </w:tr>
+      <w:tr>
+        <w:trPr>
+          <w:cantSplit/>
+        </w:trPr>
+        <w:tc>
+          <w:tcPr>
+            <w:tcW w:type="dxa" w:w="1152"/>
+            <w:shd w:fill="F1F6FA"/>
+          </w:tcPr>
+          <w:p>
+            <w:pPr>
+              <w:spacing w:after="60" w:before="60"/>
+            </w:pPr>
+            <w:r>
+              <w:rPr>
+                <w:b w:val="0"/>
+                <w:color w:val="222222"/>
+                <w:sz w:val="18"/>
+              </w:rPr>
+              <w:t>0.50</w:t>
+            </w:r>
+          </w:p>
+        </w:tc>
+        <w:tc>
+          <w:tcPr>
+            <w:tcW w:type="dxa" w:w="1224"/>
+            <w:shd w:fill="F1F6FA"/>
+          </w:tcPr>
+          <w:p>
+            <w:pPr>
+              <w:spacing w:after="60" w:before="60"/>
+            </w:pPr>
+            <w:r>
+              <w:rPr>
+                <w:b w:val="0"/>
+                <w:color w:val="222222"/>
+                <w:sz w:val="18"/>
+              </w:rPr>
+              <w:t>0.6557</w:t>
+            </w:r>
+          </w:p>
+        </w:tc>
+        <w:tc>
+          <w:tcPr>
+            <w:tcW w:type="dxa" w:w="1224"/>
+            <w:shd w:fill="F1F6FA"/>
+          </w:tcPr>
+          <w:p>
+            <w:pPr>
+              <w:spacing w:after="60" w:before="60"/>
+            </w:pPr>
+            <w:r>
+              <w:rPr>
+                <w:b w:val="0"/>
+                <w:color w:val="222222"/>
+                <w:sz w:val="18"/>
+              </w:rPr>
+              <w:t>0.8511</w:t>
+            </w:r>
+          </w:p>
+        </w:tc>
+        <w:tc>
+          <w:tcPr>
+            <w:tcW w:type="dxa" w:w="1224"/>
+            <w:shd w:fill="F1F6FA"/>
+          </w:tcPr>
+          <w:p>
+            <w:pPr>
+              <w:spacing w:after="60" w:before="60"/>
+            </w:pPr>
+            <w:r>
+              <w:rPr>
+                <w:b w:val="0"/>
+                <w:color w:val="222222"/>
+                <w:sz w:val="18"/>
+              </w:rPr>
+              <w:t>0.7407</w:t>
+            </w:r>
+          </w:p>
+        </w:tc>
+        <w:tc>
+          <w:tcPr>
+            <w:tcW w:type="dxa" w:w="720"/>
+            <w:shd w:fill="F1F6FA"/>
+          </w:tcPr>
+          <w:p>
+            <w:pPr>
+              <w:spacing w:after="60" w:before="60"/>
+            </w:pPr>
+            <w:r>
+              <w:rPr>
+                <w:b w:val="0"/>
+                <w:color w:val="222222"/>
+                <w:sz w:val="18"/>
+              </w:rPr>
+              <w:t>21</w:t>
+            </w:r>
+          </w:p>
+        </w:tc>
+        <w:tc>
+          <w:tcPr>
+            <w:tcW w:type="dxa" w:w="720"/>
+            <w:shd w:fill="F1F6FA"/>
+          </w:tcPr>
+          <w:p>
+            <w:pPr>
+              <w:spacing w:after="60" w:before="60"/>
+            </w:pPr>
+            <w:r>
+              <w:rPr>
+                <w:b w:val="0"/>
+                <w:color w:val="222222"/>
+                <w:sz w:val="18"/>
+              </w:rPr>
+              <w:t>7</w:t>
+            </w:r>
+          </w:p>
+        </w:tc>
+        <w:tc>
+          <w:tcPr>
+            <w:tcW w:type="dxa" w:w="936"/>
+            <w:shd w:fill="F1F6FA"/>
+          </w:tcPr>
+          <w:p>
+            <w:pPr>
+              <w:spacing w:after="60" w:before="60"/>
+            </w:pPr>
+            <w:r>
+              <w:rPr>
+                <w:b w:val="0"/>
+                <w:color w:val="222222"/>
+                <w:sz w:val="18"/>
+              </w:rPr>
+              <w:t>47</w:t>
+            </w:r>
+          </w:p>
+        </w:tc>
+        <w:tc>
+          <w:tcPr>
+            <w:tcW w:type="dxa" w:w="1512"/>
+            <w:shd w:fill="F1F6FA"/>
+          </w:tcPr>
+          <w:p>
+            <w:pPr>
+              <w:spacing w:after="60" w:before="60"/>
+            </w:pPr>
+            <w:r>
+              <w:rPr>
+                <w:b w:val="0"/>
+                <w:color w:val="222222"/>
+                <w:sz w:val="18"/>
+              </w:rPr>
+              <w:t>24.78</w:t>
+            </w:r>
+          </w:p>
+        </w:tc>
+      </w:tr>
+    </w:tbl>
+    <w:p>
+      <w:r>
+        <w:t>El escenario 0.075 se identifica en desarrollo: recall OOF 0.9091 y precisión 0.4462. En test alcanza recall ≥0.90, pero exige 124 revisiones frente a 76 y reduce precisión a 0.4435. La meta conjunta sigue sin alcanzarse en la rejilla evaluada. Mantengo 0.20 por la decisión original de costo; no retoco la política con el test. Costo/100 = 100×(5FN+FP)/452: unidades didácticas, no pesos.</w:t>
       </w:r>
     </w:p>
     <w:p>
@@ -2087,14 +2845,17 @@
         <w:pStyle w:val="Ttulo1"/>
       </w:pPr>
       <w:r>
-        <w:t>Umbral y capacidad de discriminación</w:t>
-      </w:r>
-    </w:p>
-    <w:p>
+        <w:t>Discriminación y calidad de las probabilidades</w:t>
+      </w:r>
+    </w:p>
+    <w:p>
+      <w:pPr>
+        <w:keepNext/>
+      </w:pPr>
       <w:r>
         <w:drawing>
           <wp:inline xmlns:a="http://schemas.openxmlformats.org/drawingml/2006/main" xmlns:pic="http://schemas.openxmlformats.org/drawingml/2006/picture">
-            <wp:extent cx="5212080" cy="2978331"/>
+            <wp:extent cx="5806440" cy="1916125"/>
             <wp:docPr id="7" name="Picture 7"/>
             <wp:cNvGraphicFramePr>
               <a:graphicFrameLocks noChangeAspect="1"/>
@@ -2103,11 +2864,11 @@
               <a:graphicData uri="http://schemas.openxmlformats.org/drawingml/2006/picture">
                 <pic:pic>
                   <pic:nvPicPr>
-                    <pic:cNvPr id="0" name="roc.png"/>
+                    <pic:cNvPr id="0" name="roc_pr.png"/>
                     <pic:cNvPicPr/>
                   </pic:nvPicPr>
                   <pic:blipFill>
-                    <a:blip r:embed="rId19"/>
+                    <a:blip r:embed="rId21"/>
                     <a:stretch>
                       <a:fillRect/>
                     </a:stretch>
@@ -2115,7 +2876,7 @@
                   <pic:spPr>
                     <a:xfrm>
                       <a:off x="0" y="0"/>
-                      <a:ext cx="5212080" cy="2978331"/>
+                      <a:ext cx="5806440" cy="1916125"/>
                     </a:xfrm>
                     <a:prstGeom prst="rect"/>
                   </pic:spPr>
@@ -2127,15 +2888,30 @@
       </w:r>
     </w:p>
     <w:p>
-      <w:r>
-        <w:t>La ROC recorre sensibilidad frente a tasa de falsos positivos. SVM obtiene AUC 0.9548 frente a 0.9229 de logística y 0.50 del baseline. Interpreto AUC como capacidad de ordenar una noticia negativa por encima de una no negativa; no representa 95.5 % de probabilidad de acertar, calibración perfecta ni rendimiento financiero futuro. Con prevalencia negativa de 13.5 %, también reporto precisión promedio de 0.8468 para SVM.</w:t>
-      </w:r>
-    </w:p>
-    <w:p>
+      <w:pPr>
+        <w:keepNext/>
+      </w:pPr>
+      <w:r>
+        <w:rPr>
+          <w:i/>
+          <w:sz w:val="18"/>
+        </w:rPr>
+        <w:t>Figura 2. Curvas ROC y precisión recall en test retrospectivo.</w:t>
+      </w:r>
+    </w:p>
+    <w:p>
+      <w:r>
+        <w:t>La ROC relaciona recall y tasa de falsos positivos; AUC=0.9548 resume el ordenamiento de la SVM frente a 0.9229 de logística. No significa 95.48 % de aciertos ni rendimiento futuro. La PR muestra precisión frente a recall y hace más visible la carga de falsas alertas con prevalencia de 13.50 %. AP: 0.8468 para SVM y 0.7329 para logística; la línea base PR es 0.1350 (Figura 2).</w:t>
+      </w:r>
+    </w:p>
+    <w:p>
+      <w:pPr>
+        <w:keepNext/>
+      </w:pPr>
       <w:r>
         <w:drawing>
           <wp:inline xmlns:a="http://schemas.openxmlformats.org/drawingml/2006/main" xmlns:pic="http://schemas.openxmlformats.org/drawingml/2006/picture">
-            <wp:extent cx="4937760" cy="2468880"/>
+            <wp:extent cx="5029200" cy="2398542"/>
             <wp:docPr id="8" name="Picture 8"/>
             <wp:cNvGraphicFramePr>
               <a:graphicFrameLocks noChangeAspect="1"/>
@@ -2144,11 +2920,11 @@
               <a:graphicData uri="http://schemas.openxmlformats.org/drawingml/2006/picture">
                 <pic:pic>
                   <pic:nvPicPr>
-                    <pic:cNvPr id="0" name="umbral.png"/>
+                    <pic:cNvPr id="0" name="fiabilidad.png"/>
                     <pic:cNvPicPr/>
                   </pic:nvPicPr>
                   <pic:blipFill>
-                    <a:blip r:embed="rId20"/>
+                    <a:blip r:embed="rId22"/>
                     <a:stretch>
                       <a:fillRect/>
                     </a:stretch>
@@ -2156,7 +2932,7 @@
                   <pic:spPr>
                     <a:xfrm>
                       <a:off x="0" y="0"/>
-                      <a:ext cx="4937760" cy="2468880"/>
+                      <a:ext cx="5029200" cy="2398542"/>
                     </a:xfrm>
                     <a:prstGeom prst="rect"/>
                   </pic:spPr>
@@ -2168,8 +2944,25 @@
       </w:r>
     </w:p>
     <w:p>
-      <w:r>
-        <w:t>El umbral 0.20 se eligió en desarrollo; ninguno cumple simultáneamente las restricciones allí fijadas. La gráfica usa predicciones fuera de muestra de desarrollo. El explorador de Streamlit sobre test es didáctico: no debe utilizarse para retocar la decisión publicada. Cambiar el umbral altera los errores, pero no la ROC ni el AUC del mismo conjunto de puntuaciones.</w:t>
+      <w:pPr>
+        <w:keepNext/>
+      </w:pPr>
+      <w:r>
+        <w:rPr>
+          <w:i/>
+          <w:sz w:val="18"/>
+        </w:rPr>
+        <w:t>Figura 3. Fiabilidad por ocho grupos de igual frecuencia en test.</w:t>
+      </w:r>
+    </w:p>
+    <w:p>
+      <w:r>
+        <w:t>Brier es el promedio de (probabilidad−etiqueta)²: menor es mejor. SVM obtiene 0.0463 frente a 0.0740. Su probabilidad media es 0.1365 y la prevalencia 0.1350. Son indicios favorables, no una prueba de calibración perfecta: Brier también combina resolución y error de calibración, y la media global puede ocultar desajustes por segmento (Figura 3).</w:t>
+      </w:r>
+    </w:p>
+    <w:p>
+      <w:r>
+        <w:t>Una probabilidad interpretable permite relacionar umbral y costos; aun así, el umbral operativo se valida con OOF y capacidad de revisión. Cambiarlo no altera ROC/AUC del mismo score. El explorador de Streamlit sobre test es ilustrativo, no una herramienta para optimizar esta entrega.</w:t>
       </w:r>
     </w:p>
     <w:p>
@@ -2182,7 +2975,19 @@
         <w:pStyle w:val="Ttulo1"/>
       </w:pPr>
       <w:r>
-        <w:t>Generalización y comparación estadística</w:t>
+        <w:t>Validación y significancia estadística</w:t>
+      </w:r>
+    </w:p>
+    <w:p>
+      <w:pPr>
+        <w:keepNext/>
+      </w:pPr>
+      <w:r>
+        <w:rPr>
+          <w:i/>
+          <w:sz w:val="18"/>
+        </w:rPr>
+        <w:t>Tabla 5. Desempeño de políticas y baselines en test</w:t>
       </w:r>
     </w:p>
     <w:tbl>
@@ -2219,13 +3024,13 @@
                 <w:color w:val="FFFFFF"/>
                 <w:sz w:val="18"/>
               </w:rPr>
-              <w:t>Modelo y política</w:t>
-            </w:r>
-          </w:p>
-        </w:tc>
-        <w:tc>
-          <w:tcPr>
-            <w:tcW w:type="dxa" w:w="1368"/>
+              <w:t>Política</w:t>
+            </w:r>
+          </w:p>
+        </w:tc>
+        <w:tc>
+          <w:tcPr>
+            <w:tcW w:type="dxa" w:w="1382"/>
             <w:shd w:fill="004481"/>
           </w:tcPr>
           <w:p>
@@ -2238,13 +3043,13 @@
                 <w:color w:val="FFFFFF"/>
                 <w:sz w:val="18"/>
               </w:rPr>
-              <w:t>Accuracy</w:t>
-            </w:r>
-          </w:p>
-        </w:tc>
-        <w:tc>
-          <w:tcPr>
-            <w:tcW w:type="dxa" w:w="1368"/>
+              <w:t>Acc.</w:t>
+            </w:r>
+          </w:p>
+        </w:tc>
+        <w:tc>
+          <w:tcPr>
+            <w:tcW w:type="dxa" w:w="1382"/>
             <w:shd w:fill="004481"/>
           </w:tcPr>
           <w:p>
@@ -2257,13 +3062,13 @@
                 <w:color w:val="FFFFFF"/>
                 <w:sz w:val="18"/>
               </w:rPr>
-              <w:t>Precisión</w:t>
-            </w:r>
-          </w:p>
-        </w:tc>
-        <w:tc>
-          <w:tcPr>
-            <w:tcW w:type="dxa" w:w="1368"/>
+              <w:t>Prec.</w:t>
+            </w:r>
+          </w:p>
+        </w:tc>
+        <w:tc>
+          <w:tcPr>
+            <w:tcW w:type="dxa" w:w="1382"/>
             <w:shd w:fill="004481"/>
           </w:tcPr>
           <w:p>
@@ -2282,7 +3087,7 @@
         </w:tc>
         <w:tc>
           <w:tcPr>
-            <w:tcW w:type="dxa" w:w="1368"/>
+            <w:tcW w:type="dxa" w:w="1382"/>
             <w:shd w:fill="004481"/>
           </w:tcPr>
           <w:p>
@@ -2301,7 +3106,7 @@
         </w:tc>
         <w:tc>
           <w:tcPr>
-            <w:tcW w:type="dxa" w:w="1440"/>
+            <w:tcW w:type="dxa" w:w="1382"/>
             <w:shd w:fill="004481"/>
           </w:tcPr>
           <w:p>
@@ -2338,102 +3143,102 @@
                 <w:color w:val="222222"/>
                 <w:sz w:val="18"/>
               </w:rPr>
-              <w:t>Logística 0.125</w:t>
-            </w:r>
-          </w:p>
-        </w:tc>
-        <w:tc>
-          <w:tcPr>
-            <w:tcW w:type="dxa" w:w="1368"/>
-            <w:shd w:fill="F1F6FA"/>
-          </w:tcPr>
-          <w:p>
-            <w:pPr>
-              <w:spacing w:after="60" w:before="60"/>
-            </w:pPr>
-            <w:r>
-              <w:rPr>
-                <w:b w:val="0"/>
-                <w:color w:val="222222"/>
-                <w:sz w:val="18"/>
-              </w:rPr>
-              <w:t>0.8053</w:t>
-            </w:r>
-          </w:p>
-        </w:tc>
-        <w:tc>
-          <w:tcPr>
-            <w:tcW w:type="dxa" w:w="1368"/>
-            <w:shd w:fill="F1F6FA"/>
-          </w:tcPr>
-          <w:p>
-            <w:pPr>
-              <w:spacing w:after="60" w:before="60"/>
-            </w:pPr>
-            <w:r>
-              <w:rPr>
-                <w:b w:val="0"/>
-                <w:color w:val="222222"/>
-                <w:sz w:val="18"/>
-              </w:rPr>
-              <w:t>0.3969</w:t>
-            </w:r>
-          </w:p>
-        </w:tc>
-        <w:tc>
-          <w:tcPr>
-            <w:tcW w:type="dxa" w:w="1368"/>
-            <w:shd w:fill="F1F6FA"/>
-          </w:tcPr>
-          <w:p>
-            <w:pPr>
-              <w:spacing w:after="60" w:before="60"/>
-            </w:pPr>
-            <w:r>
-              <w:rPr>
-                <w:b w:val="0"/>
-                <w:color w:val="222222"/>
-                <w:sz w:val="18"/>
-              </w:rPr>
-              <w:t>0.8525</w:t>
-            </w:r>
-          </w:p>
-        </w:tc>
-        <w:tc>
-          <w:tcPr>
-            <w:tcW w:type="dxa" w:w="1368"/>
-            <w:shd w:fill="F1F6FA"/>
-          </w:tcPr>
-          <w:p>
-            <w:pPr>
-              <w:spacing w:after="60" w:before="60"/>
-            </w:pPr>
-            <w:r>
-              <w:rPr>
-                <w:b w:val="0"/>
-                <w:color w:val="222222"/>
-                <w:sz w:val="18"/>
-              </w:rPr>
-              <w:t>0.5417</w:t>
-            </w:r>
-          </w:p>
-        </w:tc>
-        <w:tc>
-          <w:tcPr>
-            <w:tcW w:type="dxa" w:w="1440"/>
-            <w:shd w:fill="F1F6FA"/>
-          </w:tcPr>
-          <w:p>
-            <w:pPr>
-              <w:spacing w:after="60" w:before="60"/>
-            </w:pPr>
-            <w:r>
-              <w:rPr>
-                <w:b w:val="0"/>
-                <w:color w:val="222222"/>
-                <w:sz w:val="18"/>
-              </w:rPr>
-              <w:t>0.9229</w:t>
+              <w:t>SVM 0.20</w:t>
+            </w:r>
+          </w:p>
+        </w:tc>
+        <w:tc>
+          <w:tcPr>
+            <w:tcW w:type="dxa" w:w="1382"/>
+            <w:shd w:fill="F1F6FA"/>
+          </w:tcPr>
+          <w:p>
+            <w:pPr>
+              <w:spacing w:after="60" w:before="60"/>
+            </w:pPr>
+            <w:r>
+              <w:rPr>
+                <w:b w:val="0"/>
+                <w:color w:val="222222"/>
+                <w:sz w:val="18"/>
+              </w:rPr>
+              <w:t>0.9226</w:t>
+            </w:r>
+          </w:p>
+        </w:tc>
+        <w:tc>
+          <w:tcPr>
+            <w:tcW w:type="dxa" w:w="1382"/>
+            <w:shd w:fill="F1F6FA"/>
+          </w:tcPr>
+          <w:p>
+            <w:pPr>
+              <w:spacing w:after="60" w:before="60"/>
+            </w:pPr>
+            <w:r>
+              <w:rPr>
+                <w:b w:val="0"/>
+                <w:color w:val="222222"/>
+                <w:sz w:val="18"/>
+              </w:rPr>
+              <w:t>0.6711</w:t>
+            </w:r>
+          </w:p>
+        </w:tc>
+        <w:tc>
+          <w:tcPr>
+            <w:tcW w:type="dxa" w:w="1382"/>
+            <w:shd w:fill="F1F6FA"/>
+          </w:tcPr>
+          <w:p>
+            <w:pPr>
+              <w:spacing w:after="60" w:before="60"/>
+            </w:pPr>
+            <w:r>
+              <w:rPr>
+                <w:b w:val="0"/>
+                <w:color w:val="222222"/>
+                <w:sz w:val="18"/>
+              </w:rPr>
+              <w:t>0.8361</w:t>
+            </w:r>
+          </w:p>
+        </w:tc>
+        <w:tc>
+          <w:tcPr>
+            <w:tcW w:type="dxa" w:w="1382"/>
+            <w:shd w:fill="F1F6FA"/>
+          </w:tcPr>
+          <w:p>
+            <w:pPr>
+              <w:spacing w:after="60" w:before="60"/>
+            </w:pPr>
+            <w:r>
+              <w:rPr>
+                <w:b w:val="0"/>
+                <w:color w:val="222222"/>
+                <w:sz w:val="18"/>
+              </w:rPr>
+              <w:t>0.7445</w:t>
+            </w:r>
+          </w:p>
+        </w:tc>
+        <w:tc>
+          <w:tcPr>
+            <w:tcW w:type="dxa" w:w="1382"/>
+            <w:shd w:fill="F1F6FA"/>
+          </w:tcPr>
+          <w:p>
+            <w:pPr>
+              <w:spacing w:after="60" w:before="60"/>
+            </w:pPr>
+            <w:r>
+              <w:rPr>
+                <w:b w:val="0"/>
+                <w:color w:val="222222"/>
+                <w:sz w:val="18"/>
+              </w:rPr>
+              <w:t>0.9548</w:t>
             </w:r>
           </w:p>
         </w:tc>
@@ -2445,7 +3250,7 @@
         <w:tc>
           <w:tcPr>
             <w:tcW w:type="dxa" w:w="2448"/>
-            <w:shd w:fill="F1F6FA"/>
+            <w:shd w:fill="FFFFFF"/>
           </w:tcPr>
           <w:p>
             <w:pPr>
@@ -2463,8 +3268,8 @@
         </w:tc>
         <w:tc>
           <w:tcPr>
-            <w:tcW w:type="dxa" w:w="1368"/>
-            <w:shd w:fill="F1F6FA"/>
+            <w:tcW w:type="dxa" w:w="1382"/>
+            <w:shd w:fill="FFFFFF"/>
           </w:tcPr>
           <w:p>
             <w:pPr>
@@ -2482,8 +3287,8 @@
         </w:tc>
         <w:tc>
           <w:tcPr>
-            <w:tcW w:type="dxa" w:w="1368"/>
-            <w:shd w:fill="F1F6FA"/>
+            <w:tcW w:type="dxa" w:w="1382"/>
+            <w:shd w:fill="FFFFFF"/>
           </w:tcPr>
           <w:p>
             <w:pPr>
@@ -2501,8 +3306,8 @@
         </w:tc>
         <w:tc>
           <w:tcPr>
-            <w:tcW w:type="dxa" w:w="1368"/>
-            <w:shd w:fill="F1F6FA"/>
+            <w:tcW w:type="dxa" w:w="1382"/>
+            <w:shd w:fill="FFFFFF"/>
           </w:tcPr>
           <w:p>
             <w:pPr>
@@ -2520,8 +3325,8 @@
         </w:tc>
         <w:tc>
           <w:tcPr>
-            <w:tcW w:type="dxa" w:w="1368"/>
-            <w:shd w:fill="F1F6FA"/>
+            <w:tcW w:type="dxa" w:w="1382"/>
+            <w:shd w:fill="FFFFFF"/>
           </w:tcPr>
           <w:p>
             <w:pPr>
@@ -2539,8 +3344,8 @@
         </w:tc>
         <w:tc>
           <w:tcPr>
-            <w:tcW w:type="dxa" w:w="1440"/>
-            <w:shd w:fill="F1F6FA"/>
+            <w:tcW w:type="dxa" w:w="1382"/>
+            <w:shd w:fill="FFFFFF"/>
           </w:tcPr>
           <w:p>
             <w:pPr>
@@ -2576,102 +3381,102 @@
                 <w:color w:val="222222"/>
                 <w:sz w:val="18"/>
               </w:rPr>
-              <w:t>SVM 0.20</w:t>
-            </w:r>
-          </w:p>
-        </w:tc>
-        <w:tc>
-          <w:tcPr>
-            <w:tcW w:type="dxa" w:w="1368"/>
-            <w:shd w:fill="F1F6FA"/>
-          </w:tcPr>
-          <w:p>
-            <w:pPr>
-              <w:spacing w:after="60" w:before="60"/>
-            </w:pPr>
-            <w:r>
-              <w:rPr>
-                <w:b w:val="0"/>
-                <w:color w:val="222222"/>
-                <w:sz w:val="18"/>
-              </w:rPr>
-              <w:t>0.9226</w:t>
-            </w:r>
-          </w:p>
-        </w:tc>
-        <w:tc>
-          <w:tcPr>
-            <w:tcW w:type="dxa" w:w="1368"/>
-            <w:shd w:fill="F1F6FA"/>
-          </w:tcPr>
-          <w:p>
-            <w:pPr>
-              <w:spacing w:after="60" w:before="60"/>
-            </w:pPr>
-            <w:r>
-              <w:rPr>
-                <w:b w:val="0"/>
-                <w:color w:val="222222"/>
-                <w:sz w:val="18"/>
-              </w:rPr>
-              <w:t>0.6711</w:t>
-            </w:r>
-          </w:p>
-        </w:tc>
-        <w:tc>
-          <w:tcPr>
-            <w:tcW w:type="dxa" w:w="1368"/>
-            <w:shd w:fill="F1F6FA"/>
-          </w:tcPr>
-          <w:p>
-            <w:pPr>
-              <w:spacing w:after="60" w:before="60"/>
-            </w:pPr>
-            <w:r>
-              <w:rPr>
-                <w:b w:val="0"/>
-                <w:color w:val="222222"/>
-                <w:sz w:val="18"/>
-              </w:rPr>
-              <w:t>0.8361</w:t>
-            </w:r>
-          </w:p>
-        </w:tc>
-        <w:tc>
-          <w:tcPr>
-            <w:tcW w:type="dxa" w:w="1368"/>
-            <w:shd w:fill="F1F6FA"/>
-          </w:tcPr>
-          <w:p>
-            <w:pPr>
-              <w:spacing w:after="60" w:before="60"/>
-            </w:pPr>
-            <w:r>
-              <w:rPr>
-                <w:b w:val="0"/>
-                <w:color w:val="222222"/>
-                <w:sz w:val="18"/>
-              </w:rPr>
-              <w:t>0.7445</w:t>
-            </w:r>
-          </w:p>
-        </w:tc>
-        <w:tc>
-          <w:tcPr>
-            <w:tcW w:type="dxa" w:w="1440"/>
-            <w:shd w:fill="F1F6FA"/>
-          </w:tcPr>
-          <w:p>
-            <w:pPr>
-              <w:spacing w:after="60" w:before="60"/>
-            </w:pPr>
-            <w:r>
-              <w:rPr>
-                <w:b w:val="0"/>
-                <w:color w:val="222222"/>
-                <w:sz w:val="18"/>
-              </w:rPr>
-              <w:t>0.9548</w:t>
+              <w:t>Logística 0.125</w:t>
+            </w:r>
+          </w:p>
+        </w:tc>
+        <w:tc>
+          <w:tcPr>
+            <w:tcW w:type="dxa" w:w="1382"/>
+            <w:shd w:fill="F1F6FA"/>
+          </w:tcPr>
+          <w:p>
+            <w:pPr>
+              <w:spacing w:after="60" w:before="60"/>
+            </w:pPr>
+            <w:r>
+              <w:rPr>
+                <w:b w:val="0"/>
+                <w:color w:val="222222"/>
+                <w:sz w:val="18"/>
+              </w:rPr>
+              <w:t>0.8053</w:t>
+            </w:r>
+          </w:p>
+        </w:tc>
+        <w:tc>
+          <w:tcPr>
+            <w:tcW w:type="dxa" w:w="1382"/>
+            <w:shd w:fill="F1F6FA"/>
+          </w:tcPr>
+          <w:p>
+            <w:pPr>
+              <w:spacing w:after="60" w:before="60"/>
+            </w:pPr>
+            <w:r>
+              <w:rPr>
+                <w:b w:val="0"/>
+                <w:color w:val="222222"/>
+                <w:sz w:val="18"/>
+              </w:rPr>
+              <w:t>0.3969</w:t>
+            </w:r>
+          </w:p>
+        </w:tc>
+        <w:tc>
+          <w:tcPr>
+            <w:tcW w:type="dxa" w:w="1382"/>
+            <w:shd w:fill="F1F6FA"/>
+          </w:tcPr>
+          <w:p>
+            <w:pPr>
+              <w:spacing w:after="60" w:before="60"/>
+            </w:pPr>
+            <w:r>
+              <w:rPr>
+                <w:b w:val="0"/>
+                <w:color w:val="222222"/>
+                <w:sz w:val="18"/>
+              </w:rPr>
+              <w:t>0.8525</w:t>
+            </w:r>
+          </w:p>
+        </w:tc>
+        <w:tc>
+          <w:tcPr>
+            <w:tcW w:type="dxa" w:w="1382"/>
+            <w:shd w:fill="F1F6FA"/>
+          </w:tcPr>
+          <w:p>
+            <w:pPr>
+              <w:spacing w:after="60" w:before="60"/>
+            </w:pPr>
+            <w:r>
+              <w:rPr>
+                <w:b w:val="0"/>
+                <w:color w:val="222222"/>
+                <w:sz w:val="18"/>
+              </w:rPr>
+              <w:t>0.5417</w:t>
+            </w:r>
+          </w:p>
+        </w:tc>
+        <w:tc>
+          <w:tcPr>
+            <w:tcW w:type="dxa" w:w="1382"/>
+            <w:shd w:fill="F1F6FA"/>
+          </w:tcPr>
+          <w:p>
+            <w:pPr>
+              <w:spacing w:after="60" w:before="60"/>
+            </w:pPr>
+            <w:r>
+              <w:rPr>
+                <w:b w:val="0"/>
+                <w:color w:val="222222"/>
+                <w:sz w:val="18"/>
+              </w:rPr>
+              <w:t>0.9229</w:t>
             </w:r>
           </w:p>
         </w:tc>
@@ -2683,114 +3488,114 @@
         <w:tc>
           <w:tcPr>
             <w:tcW w:type="dxa" w:w="2448"/>
-            <w:shd w:fill="F1F6FA"/>
-          </w:tcPr>
-          <w:p>
-            <w:pPr>
-              <w:spacing w:after="60" w:before="60"/>
-            </w:pPr>
-            <w:r>
-              <w:rPr>
-                <w:b w:val="0"/>
-                <w:color w:val="222222"/>
-                <w:sz w:val="18"/>
-              </w:rPr>
-              <w:t>Mayoría</w:t>
-            </w:r>
-          </w:p>
-        </w:tc>
-        <w:tc>
-          <w:tcPr>
-            <w:tcW w:type="dxa" w:w="1368"/>
-            <w:shd w:fill="F1F6FA"/>
-          </w:tcPr>
-          <w:p>
-            <w:pPr>
-              <w:spacing w:after="60" w:before="60"/>
-            </w:pPr>
-            <w:r>
-              <w:rPr>
-                <w:b w:val="0"/>
-                <w:color w:val="222222"/>
-                <w:sz w:val="18"/>
-              </w:rPr>
-              <w:t>0.8650</w:t>
-            </w:r>
-          </w:p>
-        </w:tc>
-        <w:tc>
-          <w:tcPr>
-            <w:tcW w:type="dxa" w:w="1368"/>
-            <w:shd w:fill="F1F6FA"/>
-          </w:tcPr>
-          <w:p>
-            <w:pPr>
-              <w:spacing w:after="60" w:before="60"/>
-            </w:pPr>
-            <w:r>
-              <w:rPr>
-                <w:b w:val="0"/>
-                <w:color w:val="222222"/>
-                <w:sz w:val="18"/>
-              </w:rPr>
-              <w:t>0</w:t>
-            </w:r>
-          </w:p>
-        </w:tc>
-        <w:tc>
-          <w:tcPr>
-            <w:tcW w:type="dxa" w:w="1368"/>
-            <w:shd w:fill="F1F6FA"/>
-          </w:tcPr>
-          <w:p>
-            <w:pPr>
-              <w:spacing w:after="60" w:before="60"/>
-            </w:pPr>
-            <w:r>
-              <w:rPr>
-                <w:b w:val="0"/>
-                <w:color w:val="222222"/>
-                <w:sz w:val="18"/>
-              </w:rPr>
-              <w:t>0</w:t>
-            </w:r>
-          </w:p>
-        </w:tc>
-        <w:tc>
-          <w:tcPr>
-            <w:tcW w:type="dxa" w:w="1368"/>
-            <w:shd w:fill="F1F6FA"/>
-          </w:tcPr>
-          <w:p>
-            <w:pPr>
-              <w:spacing w:after="60" w:before="60"/>
-            </w:pPr>
-            <w:r>
-              <w:rPr>
-                <w:b w:val="0"/>
-                <w:color w:val="222222"/>
-                <w:sz w:val="18"/>
-              </w:rPr>
-              <w:t>0</w:t>
-            </w:r>
-          </w:p>
-        </w:tc>
-        <w:tc>
-          <w:tcPr>
-            <w:tcW w:type="dxa" w:w="1440"/>
-            <w:shd w:fill="F1F6FA"/>
-          </w:tcPr>
-          <w:p>
-            <w:pPr>
-              <w:spacing w:after="60" w:before="60"/>
-            </w:pPr>
-            <w:r>
-              <w:rPr>
-                <w:b w:val="0"/>
-                <w:color w:val="222222"/>
-                <w:sz w:val="18"/>
-              </w:rPr>
-              <w:t>0.50</w:t>
+            <w:shd w:fill="FFFFFF"/>
+          </w:tcPr>
+          <w:p>
+            <w:pPr>
+              <w:spacing w:after="60" w:before="60"/>
+            </w:pPr>
+            <w:r>
+              <w:rPr>
+                <w:b w:val="0"/>
+                <w:color w:val="222222"/>
+                <w:sz w:val="18"/>
+              </w:rPr>
+              <w:t>Logística 0.50</w:t>
+            </w:r>
+          </w:p>
+        </w:tc>
+        <w:tc>
+          <w:tcPr>
+            <w:tcW w:type="dxa" w:w="1382"/>
+            <w:shd w:fill="FFFFFF"/>
+          </w:tcPr>
+          <w:p>
+            <w:pPr>
+              <w:spacing w:after="60" w:before="60"/>
+            </w:pPr>
+            <w:r>
+              <w:rPr>
+                <w:b w:val="0"/>
+                <w:color w:val="222222"/>
+                <w:sz w:val="18"/>
+              </w:rPr>
+              <w:t>0.9004</w:t>
+            </w:r>
+          </w:p>
+        </w:tc>
+        <w:tc>
+          <w:tcPr>
+            <w:tcW w:type="dxa" w:w="1382"/>
+            <w:shd w:fill="FFFFFF"/>
+          </w:tcPr>
+          <w:p>
+            <w:pPr>
+              <w:spacing w:after="60" w:before="60"/>
+            </w:pPr>
+            <w:r>
+              <w:rPr>
+                <w:b w:val="0"/>
+                <w:color w:val="222222"/>
+                <w:sz w:val="18"/>
+              </w:rPr>
+              <w:t>0.9444</w:t>
+            </w:r>
+          </w:p>
+        </w:tc>
+        <w:tc>
+          <w:tcPr>
+            <w:tcW w:type="dxa" w:w="1382"/>
+            <w:shd w:fill="FFFFFF"/>
+          </w:tcPr>
+          <w:p>
+            <w:pPr>
+              <w:spacing w:after="60" w:before="60"/>
+            </w:pPr>
+            <w:r>
+              <w:rPr>
+                <w:b w:val="0"/>
+                <w:color w:val="222222"/>
+                <w:sz w:val="18"/>
+              </w:rPr>
+              <w:t>0.2787</w:t>
+            </w:r>
+          </w:p>
+        </w:tc>
+        <w:tc>
+          <w:tcPr>
+            <w:tcW w:type="dxa" w:w="1382"/>
+            <w:shd w:fill="FFFFFF"/>
+          </w:tcPr>
+          <w:p>
+            <w:pPr>
+              <w:spacing w:after="60" w:before="60"/>
+            </w:pPr>
+            <w:r>
+              <w:rPr>
+                <w:b w:val="0"/>
+                <w:color w:val="222222"/>
+                <w:sz w:val="18"/>
+              </w:rPr>
+              <w:t>0.4304</w:t>
+            </w:r>
+          </w:p>
+        </w:tc>
+        <w:tc>
+          <w:tcPr>
+            <w:tcW w:type="dxa" w:w="1382"/>
+            <w:shd w:fill="FFFFFF"/>
+          </w:tcPr>
+          <w:p>
+            <w:pPr>
+              <w:spacing w:after="60" w:before="60"/>
+            </w:pPr>
+            <w:r>
+              <w:rPr>
+                <w:b w:val="0"/>
+                <w:color w:val="222222"/>
+                <w:sz w:val="18"/>
+              </w:rPr>
+              <w:t>0.9229</w:t>
             </w:r>
           </w:p>
         </w:tc>
@@ -2814,14 +3619,133 @@
                 <w:color w:val="222222"/>
                 <w:sz w:val="18"/>
               </w:rPr>
-              <w:t>Revisar todo</w:t>
-            </w:r>
-          </w:p>
-        </w:tc>
-        <w:tc>
-          <w:tcPr>
-            <w:tcW w:type="dxa" w:w="1368"/>
-            <w:shd w:fill="F1F6FA"/>
+              <w:t>Mayoría</w:t>
+            </w:r>
+          </w:p>
+        </w:tc>
+        <w:tc>
+          <w:tcPr>
+            <w:tcW w:type="dxa" w:w="1382"/>
+            <w:shd w:fill="F1F6FA"/>
+          </w:tcPr>
+          <w:p>
+            <w:pPr>
+              <w:spacing w:after="60" w:before="60"/>
+            </w:pPr>
+            <w:r>
+              <w:rPr>
+                <w:b w:val="0"/>
+                <w:color w:val="222222"/>
+                <w:sz w:val="18"/>
+              </w:rPr>
+              <w:t>0.8650</w:t>
+            </w:r>
+          </w:p>
+        </w:tc>
+        <w:tc>
+          <w:tcPr>
+            <w:tcW w:type="dxa" w:w="1382"/>
+            <w:shd w:fill="F1F6FA"/>
+          </w:tcPr>
+          <w:p>
+            <w:pPr>
+              <w:spacing w:after="60" w:before="60"/>
+            </w:pPr>
+            <w:r>
+              <w:rPr>
+                <w:b w:val="0"/>
+                <w:color w:val="222222"/>
+                <w:sz w:val="18"/>
+              </w:rPr>
+              <w:t>0</w:t>
+            </w:r>
+          </w:p>
+        </w:tc>
+        <w:tc>
+          <w:tcPr>
+            <w:tcW w:type="dxa" w:w="1382"/>
+            <w:shd w:fill="F1F6FA"/>
+          </w:tcPr>
+          <w:p>
+            <w:pPr>
+              <w:spacing w:after="60" w:before="60"/>
+            </w:pPr>
+            <w:r>
+              <w:rPr>
+                <w:b w:val="0"/>
+                <w:color w:val="222222"/>
+                <w:sz w:val="18"/>
+              </w:rPr>
+              <w:t>0</w:t>
+            </w:r>
+          </w:p>
+        </w:tc>
+        <w:tc>
+          <w:tcPr>
+            <w:tcW w:type="dxa" w:w="1382"/>
+            <w:shd w:fill="F1F6FA"/>
+          </w:tcPr>
+          <w:p>
+            <w:pPr>
+              <w:spacing w:after="60" w:before="60"/>
+            </w:pPr>
+            <w:r>
+              <w:rPr>
+                <w:b w:val="0"/>
+                <w:color w:val="222222"/>
+                <w:sz w:val="18"/>
+              </w:rPr>
+              <w:t>0</w:t>
+            </w:r>
+          </w:p>
+        </w:tc>
+        <w:tc>
+          <w:tcPr>
+            <w:tcW w:type="dxa" w:w="1382"/>
+            <w:shd w:fill="F1F6FA"/>
+          </w:tcPr>
+          <w:p>
+            <w:pPr>
+              <w:spacing w:after="60" w:before="60"/>
+            </w:pPr>
+            <w:r>
+              <w:rPr>
+                <w:b w:val="0"/>
+                <w:color w:val="222222"/>
+                <w:sz w:val="18"/>
+              </w:rPr>
+              <w:t>0.50</w:t>
+            </w:r>
+          </w:p>
+        </w:tc>
+      </w:tr>
+      <w:tr>
+        <w:trPr>
+          <w:cantSplit/>
+        </w:trPr>
+        <w:tc>
+          <w:tcPr>
+            <w:tcW w:type="dxa" w:w="2448"/>
+            <w:shd w:fill="FFFFFF"/>
+          </w:tcPr>
+          <w:p>
+            <w:pPr>
+              <w:spacing w:after="60" w:before="60"/>
+            </w:pPr>
+            <w:r>
+              <w:rPr>
+                <w:b w:val="0"/>
+                <w:color w:val="222222"/>
+                <w:sz w:val="18"/>
+              </w:rPr>
+              <w:t>Revisar todas</w:t>
+            </w:r>
+          </w:p>
+        </w:tc>
+        <w:tc>
+          <w:tcPr>
+            <w:tcW w:type="dxa" w:w="1382"/>
+            <w:shd w:fill="FFFFFF"/>
           </w:tcPr>
           <w:p>
             <w:pPr>
@@ -2839,8 +3763,8 @@
         </w:tc>
         <w:tc>
           <w:tcPr>
-            <w:tcW w:type="dxa" w:w="1368"/>
-            <w:shd w:fill="F1F6FA"/>
+            <w:tcW w:type="dxa" w:w="1382"/>
+            <w:shd w:fill="FFFFFF"/>
           </w:tcPr>
           <w:p>
             <w:pPr>
@@ -2858,27 +3782,27 @@
         </w:tc>
         <w:tc>
           <w:tcPr>
-            <w:tcW w:type="dxa" w:w="1368"/>
-            <w:shd w:fill="F1F6FA"/>
-          </w:tcPr>
-          <w:p>
-            <w:pPr>
-              <w:spacing w:after="60" w:before="60"/>
-            </w:pPr>
-            <w:r>
-              <w:rPr>
-                <w:b w:val="0"/>
-                <w:color w:val="222222"/>
-                <w:sz w:val="18"/>
-              </w:rPr>
-              <w:t>1</w:t>
-            </w:r>
-          </w:p>
-        </w:tc>
-        <w:tc>
-          <w:tcPr>
-            <w:tcW w:type="dxa" w:w="1368"/>
-            <w:shd w:fill="F1F6FA"/>
+            <w:tcW w:type="dxa" w:w="1382"/>
+            <w:shd w:fill="FFFFFF"/>
+          </w:tcPr>
+          <w:p>
+            <w:pPr>
+              <w:spacing w:after="60" w:before="60"/>
+            </w:pPr>
+            <w:r>
+              <w:rPr>
+                <w:b w:val="0"/>
+                <w:color w:val="222222"/>
+                <w:sz w:val="18"/>
+              </w:rPr>
+              <w:t>1.0000</w:t>
+            </w:r>
+          </w:p>
+        </w:tc>
+        <w:tc>
+          <w:tcPr>
+            <w:tcW w:type="dxa" w:w="1382"/>
+            <w:shd w:fill="FFFFFF"/>
           </w:tcPr>
           <w:p>
             <w:pPr>
@@ -2896,8 +3820,8 @@
         </w:tc>
         <w:tc>
           <w:tcPr>
-            <w:tcW w:type="dxa" w:w="1440"/>
-            <w:shd w:fill="F1F6FA"/>
+            <w:tcW w:type="dxa" w:w="1382"/>
+            <w:shd w:fill="FFFFFF"/>
           </w:tcPr>
           <w:p>
             <w:pPr>
@@ -2915,6 +3839,23 @@
         </w:tc>
       </w:tr>
     </w:tbl>
+    <w:p>
+      <w:r>
+        <w:t>El baseline mayoritario omite las 61 negativas pese a su exactitud de 86.5 %. Revisar todas implica 452 revisiones y precisión de 13.5 %. Por eso justifico recall, precisión y costo, no sólo accuracy (Tabla 5).</w:t>
+      </w:r>
+    </w:p>
+    <w:p>
+      <w:pPr>
+        <w:keepNext/>
+      </w:pPr>
+      <w:r>
+        <w:rPr>
+          <w:i/>
+          <w:sz w:val="18"/>
+        </w:rPr>
+        <w:t>Tabla 6. Cinco folds externos media ± desviación estándar</w:t>
+      </w:r>
+    </w:p>
     <w:tbl>
       <w:tblPr>
         <w:tblW w:type="auto" w:w="0"/>
@@ -2922,11 +3863,9 @@
         <w:tblLook w:firstColumn="1" w:firstRow="1" w:lastColumn="0" w:lastRow="0" w:noHBand="0" w:noVBand="1" w:val="04A0"/>
       </w:tblPr>
       <w:tblGrid>
-        <w:gridCol w:w="1872"/>
-        <w:gridCol w:w="1872"/>
-        <w:gridCol w:w="1872"/>
-        <w:gridCol w:w="1872"/>
-        <w:gridCol w:w="1872"/>
+        <w:gridCol w:w="3120"/>
+        <w:gridCol w:w="3120"/>
+        <w:gridCol w:w="3120"/>
       </w:tblGrid>
       <w:tr>
         <w:trPr>
@@ -2935,7 +3874,7 @@
         </w:trPr>
         <w:tc>
           <w:tcPr>
-            <w:tcW w:type="dxa" w:w="2016"/>
+            <w:tcW w:type="dxa" w:w="1872"/>
             <w:shd w:fill="004481"/>
           </w:tcPr>
           <w:p>
@@ -2948,13 +3887,13 @@
                 <w:color w:val="FFFFFF"/>
                 <w:sz w:val="18"/>
               </w:rPr>
-              <w:t>Cinco folds externos</w:t>
-            </w:r>
-          </w:p>
-        </w:tc>
-        <w:tc>
-          <w:tcPr>
-            <w:tcW w:type="dxa" w:w="1800"/>
+              <w:t>Métrica</w:t>
+            </w:r>
+          </w:p>
+        </w:tc>
+        <w:tc>
+          <w:tcPr>
+            <w:tcW w:type="dxa" w:w="3744"/>
             <w:shd w:fill="004481"/>
           </w:tcPr>
           <w:p>
@@ -2967,13 +3906,13 @@
                 <w:color w:val="FFFFFF"/>
                 <w:sz w:val="18"/>
               </w:rPr>
-              <w:t>Recall</w:t>
-            </w:r>
-          </w:p>
-        </w:tc>
-        <w:tc>
-          <w:tcPr>
-            <w:tcW w:type="dxa" w:w="1800"/>
+              <w:t>Logística</w:t>
+            </w:r>
+          </w:p>
+        </w:tc>
+        <w:tc>
+          <w:tcPr>
+            <w:tcW w:type="dxa" w:w="3744"/>
             <w:shd w:fill="004481"/>
           </w:tcPr>
           <w:p>
@@ -2986,45 +3925,7 @@
                 <w:color w:val="FFFFFF"/>
                 <w:sz w:val="18"/>
               </w:rPr>
-              <w:t>F1</w:t>
-            </w:r>
-          </w:p>
-        </w:tc>
-        <w:tc>
-          <w:tcPr>
-            <w:tcW w:type="dxa" w:w="1800"/>
-            <w:shd w:fill="004481"/>
-          </w:tcPr>
-          <w:p>
-            <w:pPr>
-              <w:spacing w:after="60" w:before="60"/>
-            </w:pPr>
-            <w:r>
-              <w:rPr>
-                <w:b/>
-                <w:color w:val="FFFFFF"/>
-                <w:sz w:val="18"/>
-              </w:rPr>
-              <w:t>AUC</w:t>
-            </w:r>
-          </w:p>
-        </w:tc>
-        <w:tc>
-          <w:tcPr>
-            <w:tcW w:type="dxa" w:w="1800"/>
-            <w:shd w:fill="004481"/>
-          </w:tcPr>
-          <w:p>
-            <w:pPr>
-              <w:spacing w:after="60" w:before="60"/>
-            </w:pPr>
-            <w:r>
-              <w:rPr>
-                <w:b/>
-                <w:color w:val="FFFFFF"/>
-                <w:sz w:val="18"/>
-              </w:rPr>
-              <w:t>Costo por 100</w:t>
+              <w:t>SVM calibrada</w:t>
             </w:r>
           </w:p>
         </w:tc>
@@ -3035,96 +3936,58 @@
         </w:trPr>
         <w:tc>
           <w:tcPr>
-            <w:tcW w:type="dxa" w:w="2016"/>
-            <w:shd w:fill="F1F6FA"/>
-          </w:tcPr>
-          <w:p>
-            <w:pPr>
-              <w:spacing w:after="60" w:before="60"/>
-            </w:pPr>
-            <w:r>
-              <w:rPr>
-                <w:b w:val="0"/>
-                <w:color w:val="222222"/>
-                <w:sz w:val="18"/>
-              </w:rPr>
-              <w:t>Logistica</w:t>
-            </w:r>
-          </w:p>
-        </w:tc>
-        <w:tc>
-          <w:tcPr>
-            <w:tcW w:type="dxa" w:w="1800"/>
-            <w:shd w:fill="F1F6FA"/>
-          </w:tcPr>
-          <w:p>
-            <w:pPr>
-              <w:spacing w:after="60" w:before="60"/>
-            </w:pPr>
-            <w:r>
-              <w:rPr>
-                <w:b w:val="0"/>
-                <w:color w:val="222222"/>
-                <w:sz w:val="18"/>
-              </w:rPr>
-              <w:t>0.8066 ± 0.1064</w:t>
-            </w:r>
-          </w:p>
-        </w:tc>
-        <w:tc>
-          <w:tcPr>
-            <w:tcW w:type="dxa" w:w="1800"/>
-            <w:shd w:fill="F1F6FA"/>
-          </w:tcPr>
-          <w:p>
-            <w:pPr>
-              <w:spacing w:after="60" w:before="60"/>
-            </w:pPr>
-            <w:r>
-              <w:rPr>
-                <w:b w:val="0"/>
-                <w:color w:val="222222"/>
-                <w:sz w:val="18"/>
-              </w:rPr>
-              <w:t>0.5731 ± 0.0428</w:t>
-            </w:r>
-          </w:p>
-        </w:tc>
-        <w:tc>
-          <w:tcPr>
-            <w:tcW w:type="dxa" w:w="1800"/>
-            <w:shd w:fill="F1F6FA"/>
-          </w:tcPr>
-          <w:p>
-            <w:pPr>
-              <w:spacing w:after="60" w:before="60"/>
-            </w:pPr>
-            <w:r>
-              <w:rPr>
-                <w:b w:val="0"/>
-                <w:color w:val="222222"/>
-                <w:sz w:val="18"/>
-              </w:rPr>
-              <w:t>0.9128 ± 0.0347</w:t>
-            </w:r>
-          </w:p>
-        </w:tc>
-        <w:tc>
-          <w:tcPr>
-            <w:tcW w:type="dxa" w:w="1800"/>
-            <w:shd w:fill="F1F6FA"/>
-          </w:tcPr>
-          <w:p>
-            <w:pPr>
-              <w:spacing w:after="60" w:before="60"/>
-            </w:pPr>
-            <w:r>
-              <w:rPr>
-                <w:b w:val="0"/>
-                <w:color w:val="222222"/>
-                <w:sz w:val="18"/>
-              </w:rPr>
-              <w:t>26.3905 ± 6.2561</w:t>
+            <w:tcW w:type="dxa" w:w="1872"/>
+            <w:shd w:fill="F1F6FA"/>
+          </w:tcPr>
+          <w:p>
+            <w:pPr>
+              <w:spacing w:after="60" w:before="60"/>
+            </w:pPr>
+            <w:r>
+              <w:rPr>
+                <w:b w:val="0"/>
+                <w:color w:val="222222"/>
+                <w:sz w:val="18"/>
+              </w:rPr>
+              <w:t>Accuracy</w:t>
+            </w:r>
+          </w:p>
+        </w:tc>
+        <w:tc>
+          <w:tcPr>
+            <w:tcW w:type="dxa" w:w="3744"/>
+            <w:shd w:fill="F1F6FA"/>
+          </w:tcPr>
+          <w:p>
+            <w:pPr>
+              <w:spacing w:after="60" w:before="60"/>
+            </w:pPr>
+            <w:r>
+              <w:rPr>
+                <w:b w:val="0"/>
+                <w:color w:val="222222"/>
+                <w:sz w:val="18"/>
+              </w:rPr>
+              <w:t>0.8401 ± 0.0141</w:t>
+            </w:r>
+          </w:p>
+        </w:tc>
+        <w:tc>
+          <w:tcPr>
+            <w:tcW w:type="dxa" w:w="3744"/>
+            <w:shd w:fill="F1F6FA"/>
+          </w:tcPr>
+          <w:p>
+            <w:pPr>
+              <w:spacing w:after="60" w:before="60"/>
+            </w:pPr>
+            <w:r>
+              <w:rPr>
+                <w:b w:val="0"/>
+                <w:color w:val="222222"/>
+                <w:sz w:val="18"/>
+              </w:rPr>
+              <w:t>0.9148 ± 0.0224</w:t>
             </w:r>
           </w:p>
         </w:tc>
@@ -3135,26 +3998,107 @@
         </w:trPr>
         <w:tc>
           <w:tcPr>
-            <w:tcW w:type="dxa" w:w="2016"/>
-            <w:shd w:fill="F1F6FA"/>
-          </w:tcPr>
-          <w:p>
-            <w:pPr>
-              <w:spacing w:after="60" w:before="60"/>
-            </w:pPr>
-            <w:r>
-              <w:rPr>
-                <w:b w:val="0"/>
-                <w:color w:val="222222"/>
-                <w:sz w:val="18"/>
-              </w:rPr>
-              <w:t>SVM_calibrada</w:t>
-            </w:r>
-          </w:p>
-        </w:tc>
-        <w:tc>
-          <w:tcPr>
-            <w:tcW w:type="dxa" w:w="1800"/>
+            <w:tcW w:type="dxa" w:w="1872"/>
+            <w:shd w:fill="FFFFFF"/>
+          </w:tcPr>
+          <w:p>
+            <w:pPr>
+              <w:spacing w:after="60" w:before="60"/>
+            </w:pPr>
+            <w:r>
+              <w:rPr>
+                <w:b w:val="0"/>
+                <w:color w:val="222222"/>
+                <w:sz w:val="18"/>
+              </w:rPr>
+              <w:t>Precisión</w:t>
+            </w:r>
+          </w:p>
+        </w:tc>
+        <w:tc>
+          <w:tcPr>
+            <w:tcW w:type="dxa" w:w="3744"/>
+            <w:shd w:fill="FFFFFF"/>
+          </w:tcPr>
+          <w:p>
+            <w:pPr>
+              <w:spacing w:after="60" w:before="60"/>
+            </w:pPr>
+            <w:r>
+              <w:rPr>
+                <w:b w:val="0"/>
+                <w:color w:val="222222"/>
+                <w:sz w:val="18"/>
+              </w:rPr>
+              <w:t>0.4465 ± 0.0270</w:t>
+            </w:r>
+          </w:p>
+        </w:tc>
+        <w:tc>
+          <w:tcPr>
+            <w:tcW w:type="dxa" w:w="3744"/>
+            <w:shd w:fill="FFFFFF"/>
+          </w:tcPr>
+          <w:p>
+            <w:pPr>
+              <w:spacing w:after="60" w:before="60"/>
+            </w:pPr>
+            <w:r>
+              <w:rPr>
+                <w:b w:val="0"/>
+                <w:color w:val="222222"/>
+                <w:sz w:val="18"/>
+              </w:rPr>
+              <w:t>0.6477 ± 0.0758</w:t>
+            </w:r>
+          </w:p>
+        </w:tc>
+      </w:tr>
+      <w:tr>
+        <w:trPr>
+          <w:cantSplit/>
+        </w:trPr>
+        <w:tc>
+          <w:tcPr>
+            <w:tcW w:type="dxa" w:w="1872"/>
+            <w:shd w:fill="F1F6FA"/>
+          </w:tcPr>
+          <w:p>
+            <w:pPr>
+              <w:spacing w:after="60" w:before="60"/>
+            </w:pPr>
+            <w:r>
+              <w:rPr>
+                <w:b w:val="0"/>
+                <w:color w:val="222222"/>
+                <w:sz w:val="18"/>
+              </w:rPr>
+              <w:t>Recall</w:t>
+            </w:r>
+          </w:p>
+        </w:tc>
+        <w:tc>
+          <w:tcPr>
+            <w:tcW w:type="dxa" w:w="3744"/>
+            <w:shd w:fill="F1F6FA"/>
+          </w:tcPr>
+          <w:p>
+            <w:pPr>
+              <w:spacing w:after="60" w:before="60"/>
+            </w:pPr>
+            <w:r>
+              <w:rPr>
+                <w:b w:val="0"/>
+                <w:color w:val="222222"/>
+                <w:sz w:val="18"/>
+              </w:rPr>
+              <w:t>0.8066 ± 0.1064</w:t>
+            </w:r>
+          </w:p>
+        </w:tc>
+        <w:tc>
+          <w:tcPr>
+            <w:tcW w:type="dxa" w:w="3744"/>
             <w:shd w:fill="F1F6FA"/>
           </w:tcPr>
           <w:p>
@@ -3171,10 +4115,53 @@
             </w:r>
           </w:p>
         </w:tc>
-        <w:tc>
-          <w:tcPr>
-            <w:tcW w:type="dxa" w:w="1800"/>
-            <w:shd w:fill="F1F6FA"/>
+      </w:tr>
+      <w:tr>
+        <w:trPr>
+          <w:cantSplit/>
+        </w:trPr>
+        <w:tc>
+          <w:tcPr>
+            <w:tcW w:type="dxa" w:w="1872"/>
+            <w:shd w:fill="FFFFFF"/>
+          </w:tcPr>
+          <w:p>
+            <w:pPr>
+              <w:spacing w:after="60" w:before="60"/>
+            </w:pPr>
+            <w:r>
+              <w:rPr>
+                <w:b w:val="0"/>
+                <w:color w:val="222222"/>
+                <w:sz w:val="18"/>
+              </w:rPr>
+              <w:t>F1</w:t>
+            </w:r>
+          </w:p>
+        </w:tc>
+        <w:tc>
+          <w:tcPr>
+            <w:tcW w:type="dxa" w:w="3744"/>
+            <w:shd w:fill="FFFFFF"/>
+          </w:tcPr>
+          <w:p>
+            <w:pPr>
+              <w:spacing w:after="60" w:before="60"/>
+            </w:pPr>
+            <w:r>
+              <w:rPr>
+                <w:b w:val="0"/>
+                <w:color w:val="222222"/>
+                <w:sz w:val="18"/>
+              </w:rPr>
+              <w:t>0.5731 ± 0.0428</w:t>
+            </w:r>
+          </w:p>
+        </w:tc>
+        <w:tc>
+          <w:tcPr>
+            <w:tcW w:type="dxa" w:w="3744"/>
+            <w:shd w:fill="FFFFFF"/>
           </w:tcPr>
           <w:p>
             <w:pPr>
@@ -3190,9 +4177,52 @@
             </w:r>
           </w:p>
         </w:tc>
-        <w:tc>
-          <w:tcPr>
-            <w:tcW w:type="dxa" w:w="1800"/>
+      </w:tr>
+      <w:tr>
+        <w:trPr>
+          <w:cantSplit/>
+        </w:trPr>
+        <w:tc>
+          <w:tcPr>
+            <w:tcW w:type="dxa" w:w="1872"/>
+            <w:shd w:fill="F1F6FA"/>
+          </w:tcPr>
+          <w:p>
+            <w:pPr>
+              <w:spacing w:after="60" w:before="60"/>
+            </w:pPr>
+            <w:r>
+              <w:rPr>
+                <w:b w:val="0"/>
+                <w:color w:val="222222"/>
+                <w:sz w:val="18"/>
+              </w:rPr>
+              <w:t>AUC</w:t>
+            </w:r>
+          </w:p>
+        </w:tc>
+        <w:tc>
+          <w:tcPr>
+            <w:tcW w:type="dxa" w:w="3744"/>
+            <w:shd w:fill="F1F6FA"/>
+          </w:tcPr>
+          <w:p>
+            <w:pPr>
+              <w:spacing w:after="60" w:before="60"/>
+            </w:pPr>
+            <w:r>
+              <w:rPr>
+                <w:b w:val="0"/>
+                <w:color w:val="222222"/>
+                <w:sz w:val="18"/>
+              </w:rPr>
+              <w:t>0.9128 ± 0.0347</w:t>
+            </w:r>
+          </w:p>
+        </w:tc>
+        <w:tc>
+          <w:tcPr>
+            <w:tcW w:type="dxa" w:w="3744"/>
             <w:shd w:fill="F1F6FA"/>
           </w:tcPr>
           <w:p>
@@ -3209,10 +4239,53 @@
             </w:r>
           </w:p>
         </w:tc>
-        <w:tc>
-          <w:tcPr>
-            <w:tcW w:type="dxa" w:w="1800"/>
-            <w:shd w:fill="F1F6FA"/>
+      </w:tr>
+      <w:tr>
+        <w:trPr>
+          <w:cantSplit/>
+        </w:trPr>
+        <w:tc>
+          <w:tcPr>
+            <w:tcW w:type="dxa" w:w="1872"/>
+            <w:shd w:fill="FFFFFF"/>
+          </w:tcPr>
+          <w:p>
+            <w:pPr>
+              <w:spacing w:after="60" w:before="60"/>
+            </w:pPr>
+            <w:r>
+              <w:rPr>
+                <w:b w:val="0"/>
+                <w:color w:val="222222"/>
+                <w:sz w:val="18"/>
+              </w:rPr>
+              <w:t>Costo/100</w:t>
+            </w:r>
+          </w:p>
+        </w:tc>
+        <w:tc>
+          <w:tcPr>
+            <w:tcW w:type="dxa" w:w="3744"/>
+            <w:shd w:fill="FFFFFF"/>
+          </w:tcPr>
+          <w:p>
+            <w:pPr>
+              <w:spacing w:after="60" w:before="60"/>
+            </w:pPr>
+            <w:r>
+              <w:rPr>
+                <w:b w:val="0"/>
+                <w:color w:val="222222"/>
+                <w:sz w:val="18"/>
+              </w:rPr>
+              <w:t>26.3905 ± 6.2561</w:t>
+            </w:r>
+          </w:p>
+        </w:tc>
+        <w:tc>
+          <w:tcPr>
+            <w:tcW w:type="dxa" w:w="3744"/>
+            <w:shd w:fill="FFFFFF"/>
           </w:tcPr>
           <w:p>
             <w:pPr>
@@ -3232,17 +4305,22 @@
     </w:tbl>
     <w:p>
       <w:r>
-        <w:t>Las dispersiones son desviaciones estándar entre folds, no intervalos de confianza. SVM obtiene el menor costo medio y es mi candidata. Los hiperparámetros fijos y la anidación del umbral ayudan a controlar fuga de información; el tamaño del corpus y la selección entre modelos siguen siendo limitaciones.</w:t>
-      </w:r>
-    </w:p>
-    <w:p>
-      <w:r>
-        <w:t>Con 2,000 remuestreos estratificados pareados del test, el IC percentil 95 % del AUC de SVM es [0.9284, 0.9761] y del F1 [0.6715, 0.8120]. El aumento de recall respecto al umbral 0.50 es de 18.03 puntos, con IC [8.20, 27.87] puntos. Estos intervalos condicionan al test disponible y no equivalen a una prueba externa.</w:t>
-      </w:r>
-    </w:p>
-    <w:p>
-      <w:r>
-        <w:t>McNemar exacto compara aciertos pareados entre ambos umbrales: 18 casos correctos sólo con 0.50 y 11 sólo con 0.20; p=0.2649. No rechazo igualdad de exactitud al 5 %. Esto no contradice el incremento de recall: son criterios diferentes, y el ajuste busca reducir omisiones ponderadas, no maximizar exactitud. No aplico una prueba t ingenua a cinco folds correlacionados ni declaro superioridad estadística de AUC entre modelos sin una prueba específica.</w:t>
+        <w:t>SVM tiene menor costo medio externo (Tabla 6). Las dispersiones entre folds no son IC. Bootstrap estratificado pareado, 2,000 repeticiones y semilla 20261022: IC95 % AUC SVM [0.9284, 0.9761], F1 [0.6715, 0.8120] y aumento de recall al bajar 0.50→0.20 de 18.03 puntos, IC [8.20, 27.87].</w:t>
+      </w:r>
+    </w:p>
+    <w:p>
+      <w:r>
+        <w:t>Entre algoritmos, ΔAUC SVM−logística=0.0319, IC95 % [0.0206, 0.0451], excluye cero. La cola bootstrap bilateral corregida es 0.0009995; la reporto como cola empírica, no como prueba nula centrada. McNemar exacto entre políticas da 54 aciertos sólo SVM frente a 1 sólo logística, p≈3.1×10⁻¹⁵. Entre umbrales de SVM da 18 frente a 11, p=0.2649: no rechazo igualdad de exactitud; eso no contradice mayor recall (Virtanen et al., 2020).</w:t>
+      </w:r>
+    </w:p>
+    <w:p>
+      <w:r>
+        <w:t>Son análisis exploratorios condicionales al mismo test de Actividad 5, sin corrección por multiplicidad ni incertidumbre de reentrenamiento. Favorecen a SVM en este conjunto; no sustituyen validación prospectiva externa. NumPy sostiene los remuestreos reproducibles (Harris et al., 2020).</w:t>
+      </w:r>
+    </w:p>
+    <w:p>
+      <w:r>
+        <w:br w:type="page"/>
       </w:r>
     </w:p>
     <w:p>
@@ -3250,12 +4328,408 @@
         <w:pStyle w:val="Ttulo1"/>
       </w:pPr>
       <w:r>
-        <w:t>Seguimiento de experimentos</w:t>
-      </w:r>
-    </w:p>
-    <w:p>
-      <w:r>
-        <w:t>MLflow permite inspeccionar parámetros, métricas y artefactos de las dos corridas definitivas y la comparación con A/B. Las capturas del panel y el paquete portable de evidencia acompañan esta entrega. Los modelos se registran como archivos de artefacto; no se afirma que exista un servicio productivo ni un Model Registry con aprobaciones operativas.</w:t>
+        <w:t>Prueba A B simulada y alcance causal</w:t>
+      </w:r>
+    </w:p>
+    <w:p>
+      <w:r>
+        <w:t>Asigno aleatoriamente por perfil 150 personajes: 75 a A manual y 75 a B asistida, una revisión por cliente. Indicador: revisión completa en 48 horas. Probabilidades generadoras 0.72 y 0.85 son supuestos. Resultado simulado: 48/75 frente a 59/75, diferencia 14.67 puntos. Fisher bilateral p=0.0703: no rechazo H0 al 5 %. IC aproximado conservador Wilson–Bonferroni [−8.73, 36.23] puntos.</w:t>
+      </w:r>
+    </w:p>
+    <w:p>
+      <w:pPr>
+        <w:keepNext/>
+      </w:pPr>
+      <w:r>
+        <w:rPr>
+          <w:i/>
+          <w:sz w:val="18"/>
+        </w:rPr>
+        <w:t>Tabla 7. Qué distingue validación cruzada de un A B real</w:t>
+      </w:r>
+    </w:p>
+    <w:tbl>
+      <w:tblPr>
+        <w:tblW w:type="auto" w:w="0"/>
+        <w:tblLayout w:type="fixed"/>
+        <w:tblLook w:firstColumn="1" w:firstRow="1" w:lastColumn="0" w:lastRow="0" w:noHBand="0" w:noVBand="1" w:val="04A0"/>
+      </w:tblPr>
+      <w:tblGrid>
+        <w:gridCol w:w="3120"/>
+        <w:gridCol w:w="3120"/>
+        <w:gridCol w:w="3120"/>
+      </w:tblGrid>
+      <w:tr>
+        <w:trPr>
+          <w:cantSplit/>
+          <w:tblHeader/>
+        </w:trPr>
+        <w:tc>
+          <w:tcPr>
+            <w:tcW w:type="dxa" w:w="1584"/>
+            <w:shd w:fill="004481"/>
+          </w:tcPr>
+          <w:p>
+            <w:pPr>
+              <w:spacing w:after="60" w:before="60"/>
+            </w:pPr>
+            <w:r>
+              <w:rPr>
+                <w:b/>
+                <w:color w:val="FFFFFF"/>
+                <w:sz w:val="18"/>
+              </w:rPr>
+              <w:t>Dimensión</w:t>
+            </w:r>
+          </w:p>
+        </w:tc>
+        <w:tc>
+          <w:tcPr>
+            <w:tcW w:type="dxa" w:w="3888"/>
+            <w:shd w:fill="004481"/>
+          </w:tcPr>
+          <w:p>
+            <w:pPr>
+              <w:spacing w:after="60" w:before="60"/>
+            </w:pPr>
+            <w:r>
+              <w:rPr>
+                <w:b/>
+                <w:color w:val="FFFFFF"/>
+                <w:sz w:val="18"/>
+              </w:rPr>
+              <w:t>Validación cruzada</w:t>
+            </w:r>
+          </w:p>
+        </w:tc>
+        <w:tc>
+          <w:tcPr>
+            <w:tcW w:type="dxa" w:w="3888"/>
+            <w:shd w:fill="004481"/>
+          </w:tcPr>
+          <w:p>
+            <w:pPr>
+              <w:spacing w:after="60" w:before="60"/>
+            </w:pPr>
+            <w:r>
+              <w:rPr>
+                <w:b/>
+                <w:color w:val="FFFFFF"/>
+                <w:sz w:val="18"/>
+              </w:rPr>
+              <w:t>Prueba A/B</w:t>
+            </w:r>
+          </w:p>
+        </w:tc>
+      </w:tr>
+      <w:tr>
+        <w:trPr>
+          <w:cantSplit/>
+        </w:trPr>
+        <w:tc>
+          <w:tcPr>
+            <w:tcW w:type="dxa" w:w="1584"/>
+            <w:shd w:fill="F1F6FA"/>
+          </w:tcPr>
+          <w:p>
+            <w:pPr>
+              <w:spacing w:after="60" w:before="60"/>
+            </w:pPr>
+            <w:r>
+              <w:rPr>
+                <w:b w:val="0"/>
+                <w:color w:val="222222"/>
+                <w:sz w:val="18"/>
+              </w:rPr>
+              <w:t>Pregunta</w:t>
+            </w:r>
+          </w:p>
+        </w:tc>
+        <w:tc>
+          <w:tcPr>
+            <w:tcW w:type="dxa" w:w="3888"/>
+            <w:shd w:fill="F1F6FA"/>
+          </w:tcPr>
+          <w:p>
+            <w:pPr>
+              <w:spacing w:after="60" w:before="60"/>
+            </w:pPr>
+            <w:r>
+              <w:rPr>
+                <w:b w:val="0"/>
+                <w:color w:val="222222"/>
+                <w:sz w:val="18"/>
+              </w:rPr>
+              <w:t>¿Generaliza el predictor?</w:t>
+            </w:r>
+          </w:p>
+        </w:tc>
+        <w:tc>
+          <w:tcPr>
+            <w:tcW w:type="dxa" w:w="3888"/>
+            <w:shd w:fill="F1F6FA"/>
+          </w:tcPr>
+          <w:p>
+            <w:pPr>
+              <w:spacing w:after="60" w:before="60"/>
+            </w:pPr>
+            <w:r>
+              <w:rPr>
+                <w:b w:val="0"/>
+                <w:color w:val="222222"/>
+                <w:sz w:val="18"/>
+              </w:rPr>
+              <w:t>¿Cambia el resultado del proceso?</w:t>
+            </w:r>
+          </w:p>
+        </w:tc>
+      </w:tr>
+      <w:tr>
+        <w:trPr>
+          <w:cantSplit/>
+        </w:trPr>
+        <w:tc>
+          <w:tcPr>
+            <w:tcW w:type="dxa" w:w="1584"/>
+            <w:shd w:fill="FFFFFF"/>
+          </w:tcPr>
+          <w:p>
+            <w:pPr>
+              <w:spacing w:after="60" w:before="60"/>
+            </w:pPr>
+            <w:r>
+              <w:rPr>
+                <w:b w:val="0"/>
+                <w:color w:val="222222"/>
+                <w:sz w:val="18"/>
+              </w:rPr>
+              <w:t>Unidad</w:t>
+            </w:r>
+          </w:p>
+        </w:tc>
+        <w:tc>
+          <w:tcPr>
+            <w:tcW w:type="dxa" w:w="3888"/>
+            <w:shd w:fill="FFFFFF"/>
+          </w:tcPr>
+          <w:p>
+            <w:pPr>
+              <w:spacing w:after="60" w:before="60"/>
+            </w:pPr>
+            <w:r>
+              <w:rPr>
+                <w:b w:val="0"/>
+                <w:color w:val="222222"/>
+                <w:sz w:val="18"/>
+              </w:rPr>
+              <w:t>Noticia del corpus.</w:t>
+            </w:r>
+          </w:p>
+        </w:tc>
+        <w:tc>
+          <w:tcPr>
+            <w:tcW w:type="dxa" w:w="3888"/>
+            <w:shd w:fill="FFFFFF"/>
+          </w:tcPr>
+          <w:p>
+            <w:pPr>
+              <w:spacing w:after="60" w:before="60"/>
+            </w:pPr>
+            <w:r>
+              <w:rPr>
+                <w:b w:val="0"/>
+                <w:color w:val="222222"/>
+                <w:sz w:val="18"/>
+              </w:rPr>
+              <w:t>Cliente/revisión o banquero, según diseño.</w:t>
+            </w:r>
+          </w:p>
+        </w:tc>
+      </w:tr>
+      <w:tr>
+        <w:trPr>
+          <w:cantSplit/>
+        </w:trPr>
+        <w:tc>
+          <w:tcPr>
+            <w:tcW w:type="dxa" w:w="1584"/>
+            <w:shd w:fill="F1F6FA"/>
+          </w:tcPr>
+          <w:p>
+            <w:pPr>
+              <w:spacing w:after="60" w:before="60"/>
+            </w:pPr>
+            <w:r>
+              <w:rPr>
+                <w:b w:val="0"/>
+                <w:color w:val="222222"/>
+                <w:sz w:val="18"/>
+              </w:rPr>
+              <w:t>Aleatorización</w:t>
+            </w:r>
+          </w:p>
+        </w:tc>
+        <w:tc>
+          <w:tcPr>
+            <w:tcW w:type="dxa" w:w="3888"/>
+            <w:shd w:fill="F1F6FA"/>
+          </w:tcPr>
+          <w:p>
+            <w:pPr>
+              <w:spacing w:after="60" w:before="60"/>
+            </w:pPr>
+            <w:r>
+              <w:rPr>
+                <w:b w:val="0"/>
+                <w:color w:val="222222"/>
+                <w:sz w:val="18"/>
+              </w:rPr>
+              <w:t>Partición estratificada de folds.</w:t>
+            </w:r>
+          </w:p>
+        </w:tc>
+        <w:tc>
+          <w:tcPr>
+            <w:tcW w:type="dxa" w:w="3888"/>
+            <w:shd w:fill="F1F6FA"/>
+          </w:tcPr>
+          <w:p>
+            <w:pPr>
+              <w:spacing w:after="60" w:before="60"/>
+            </w:pPr>
+            <w:r>
+              <w:rPr>
+                <w:b w:val="0"/>
+                <w:color w:val="222222"/>
+                <w:sz w:val="18"/>
+              </w:rPr>
+              <w:t>Asignación aleatoria de intervención.</w:t>
+            </w:r>
+          </w:p>
+        </w:tc>
+      </w:tr>
+      <w:tr>
+        <w:trPr>
+          <w:cantSplit/>
+        </w:trPr>
+        <w:tc>
+          <w:tcPr>
+            <w:tcW w:type="dxa" w:w="1584"/>
+            <w:shd w:fill="FFFFFF"/>
+          </w:tcPr>
+          <w:p>
+            <w:pPr>
+              <w:spacing w:after="60" w:before="60"/>
+            </w:pPr>
+            <w:r>
+              <w:rPr>
+                <w:b w:val="0"/>
+                <w:color w:val="222222"/>
+                <w:sz w:val="18"/>
+              </w:rPr>
+              <w:t>Conclusión</w:t>
+            </w:r>
+          </w:p>
+        </w:tc>
+        <w:tc>
+          <w:tcPr>
+            <w:tcW w:type="dxa" w:w="3888"/>
+            <w:shd w:fill="FFFFFF"/>
+          </w:tcPr>
+          <w:p>
+            <w:pPr>
+              <w:spacing w:after="60" w:before="60"/>
+            </w:pPr>
+            <w:r>
+              <w:rPr>
+                <w:b w:val="0"/>
+                <w:color w:val="222222"/>
+                <w:sz w:val="18"/>
+              </w:rPr>
+              <w:t>Desempeño fuera de entrenamiento.</w:t>
+            </w:r>
+          </w:p>
+        </w:tc>
+        <w:tc>
+          <w:tcPr>
+            <w:tcW w:type="dxa" w:w="3888"/>
+            <w:shd w:fill="FFFFFF"/>
+          </w:tcPr>
+          <w:p>
+            <w:pPr>
+              <w:spacing w:after="60" w:before="60"/>
+            </w:pPr>
+            <w:r>
+              <w:rPr>
+                <w:b w:val="0"/>
+                <w:color w:val="222222"/>
+                <w:sz w:val="18"/>
+              </w:rPr>
+              <w:t>Efecto causal bajo diseño válido; aquí sólo se simula.</w:t>
+            </w:r>
+          </w:p>
+        </w:tc>
+      </w:tr>
+    </w:tbl>
+    <w:p>
+      <w:pPr>
+        <w:keepNext/>
+      </w:pPr>
+      <w:r>
+        <w:drawing>
+          <wp:inline xmlns:a="http://schemas.openxmlformats.org/drawingml/2006/main" xmlns:pic="http://schemas.openxmlformats.org/drawingml/2006/picture">
+            <wp:extent cx="4206240" cy="2103120"/>
+            <wp:docPr id="9" name="Picture 9"/>
+            <wp:cNvGraphicFramePr>
+              <a:graphicFrameLocks noChangeAspect="1"/>
+            </wp:cNvGraphicFramePr>
+            <a:graphic>
+              <a:graphicData uri="http://schemas.openxmlformats.org/drawingml/2006/picture">
+                <pic:pic>
+                  <pic:nvPicPr>
+                    <pic:cNvPr id="0" name="ab.png"/>
+                    <pic:cNvPicPr/>
+                  </pic:nvPicPr>
+                  <pic:blipFill>
+                    <a:blip r:embed="rId23"/>
+                    <a:stretch>
+                      <a:fillRect/>
+                    </a:stretch>
+                  </pic:blipFill>
+                  <pic:spPr>
+                    <a:xfrm>
+                      <a:off x="0" y="0"/>
+                      <a:ext cx="4206240" cy="2103120"/>
+                    </a:xfrm>
+                    <a:prstGeom prst="rect"/>
+                  </pic:spPr>
+                </pic:pic>
+              </a:graphicData>
+            </a:graphic>
+          </wp:inline>
+        </w:drawing>
+      </w:r>
+    </w:p>
+    <w:p>
+      <w:pPr>
+        <w:keepNext/>
+      </w:pPr>
+      <w:r>
+        <w:rPr>
+          <w:i/>
+          <w:sz w:val="18"/>
+        </w:rPr>
+        <w:t>Figura 4. Revisiones completas en el A B simulado sin clientes reales.</w:t>
+      </w:r>
+    </w:p>
+    <w:p>
+      <w:r>
+        <w:t>Con 75 por brazo, α=0.05 bilateral y efecto supuesto de 13 puntos, la potencia normal aproximada es 0.4911. MDE al 80 %: 17.84 puntos, o 17.9 al redondear conservadoramente hacia arriba. No es potencia exacta de Fisher ni potencia calculada desde el efecto observado. El diseño es poco sensible; la no significancia no demuestra ausencia de efecto ni permite atribuirla exclusivamente a la muestra.</w:t>
+      </w:r>
+    </w:p>
+    <w:p>
+      <w:r>
+        <w:t>Para el piloto fijaría cuatro semanas, protocolo congelado, análisis por intención de tratar y sin detener por significancia; una revisión faltante cuenta como incompleta. Completa exige fuentes, perfil, horizonte, costos y aprobación humana. Se requieren 156 por brazo, 174 con 10 % de pérdidas bajo los supuestos; al asignar por banquero debe ajustarse por agrupación y contaminación. Incluso una simulación significativa no demostraría efecto causal real.</w:t>
       </w:r>
     </w:p>
     <w:p>
@@ -3268,32 +4742,22 @@
         <w:pStyle w:val="Ttulo1"/>
       </w:pPr>
       <w:r>
-        <w:t>Prueba A B e impacto en el negocio</w:t>
-      </w:r>
-    </w:p>
-    <w:p>
-      <w:r>
-        <w:t>Implementé una simulación aleatoria estratificada por perfil: 75 personajes en A (revisión manual) y 75 en B (asistida), una revisión por cliente. El indicador primario es revisión completa en 48 horas. Las probabilidades 0.72 y 0.85 son supuestos generadores, no estimaciones observadas. El resultado reproducible es 48/75 frente a 59/75: diferencia de 14.67 puntos porcentuales.</w:t>
-      </w:r>
-    </w:p>
-    <w:p>
-      <w:r>
-        <w:t>Fisher exacto bilateral arroja p=0.0703; con α=0.05 no rechazo H0: pA=pB. Un intervalo aproximado conservador de diferencia, formado con Wilson y corrección Bonferroni, es [−8.73, 36.23] puntos. Incluso una simulación significativa no probaría causalidad real: aquí sólo demuestro el procedimiento. CV evalúa generalización predictiva; un A/B real evaluaría efecto del flujo de trabajo sobre personas y procesos.</w:t>
-      </w:r>
-    </w:p>
-    <w:p>
-      <w:r>
-        <w:t>Para un piloto futuro fijaría cuatro semanas, asignación previa y análisis por intención de tratar; una revisión faltante cuenta como no completada. “Completa” exige fuente contrastada, perfil y horizonte revisados, costos documentados y visto bueno humano. Congelaría indicador, hipótesis y muestra antes de observar resultados, sin detener por significancia. El cálculo normal aproximado para 13 puntos de diferencia, potencia 80 % y α=0.05 requiere 156 por brazo, 174 con 10 % de pérdidas. No basta la cartera didáctica de 150; si se asigna por banquero, debe recalcularse por correlación y contaminación.</w:t>
-      </w:r>
-    </w:p>
-    <w:p>
-      <w:r>
-        <w:t>Como supuesto del caso, cobrar 1 % por venta y 1 % por compra implica 2 % sobre el nocional migrado. Con una mejora bruta anual de 3 puntos y sólo 35 % de cartera migrada, el aporte bruto sobre cartera es 1.05 puntos, frente a 0.70 puntos de corretaje sobre cartera: no se deben comparar bases diferentes. Sobre la parte migrada, 3 puntos sólo superan el costo de 2 puntos después de ocho meses bajo un supuesto lineal sin otros gastos. El clasificador no acredita esa mejora.</w:t>
-      </w:r>
-    </w:p>
-    <w:p>
-      <w:r>
-        <w:t>Consulté el índice público de BBVA México: 61 fichas DICI y 693 registros de comisiones por serie. La extracción automatizada conserva fuente y fecha; requiere validar vigencia, periodicidad y serie. Los gastos del fondo no son ingreso neto íntegro del banco. Si un rendimiento ya descuenta esos gastos, restarlos otra vez duplicaría el costo. Las señales nunca deben promover rotación sólo para generar corretaje.</w:t>
+        <w:t>Impacto bancario y decisión final</w:t>
+      </w:r>
+    </w:p>
+    <w:p>
+      <w:r>
+        <w:t>Como Banquero Patrimonial Sr., prefiero 76 revisiones con 10 omisiones a 47 con 21, sujeto a capacidad y supervisión. El umbral 0.075 recupera cuatro noticias adicionales respecto a 0.20, pero añade 48 revisiones: esa carga afecta tiempos, experiencia del cliente y riesgo de fatiga. La decisión debe preservar perfil y calidad de atención, nunca incentivar rotación para generar corretaje.</w:t>
+      </w:r>
+    </w:p>
+    <w:p>
+      <w:r>
+        <w:t>El 1 % por venta más 1 % por compra es un supuesto didáctico, no una tarifa general verificada de BBVA. Son 2 % sobre el nocional migrado. Si migro 35 % de cartera y supongo mejora bruta anual de 3 puntos, aportaría 1.05 puntos sobre cartera frente a 0.70 de corretaje; sobre la parte migrada, el equilibrio lineal sería ocho meses sin otros gastos. El clasificador no acredita esa mejora ni promete rendimiento.</w:t>
+      </w:r>
+    </w:p>
+    <w:p>
+      <w:r>
+        <w:t>El índice público consultado el 22 de octubre conserva 61 fichas DICI y 693 registros por serie. La extracción automática exige confirmar vigencia, periodicidad y serie en el original. Los gastos de fondos no equivalen al ingreso neto del banco; si el rendimiento ya es neto, no los descuento dos veces. Estas fuentes contextualizan costos, no entrenan el clasificador (BBVA México, s. f.).</w:t>
       </w:r>
     </w:p>
     <w:p>
@@ -3301,17 +4765,495 @@
         <w:pStyle w:val="Ttulo1"/>
       </w:pPr>
       <w:r>
-        <w:t>Conclusión y siguientes controles</w:t>
-      </w:r>
-    </w:p>
-    <w:p>
-      <w:r>
-        <w:t>Mantengo SVM 0.20 como candidata académica, con supervisión humana y meta pendiente. Antes de un piloto necesito corpus mexicano con licencia apta, separación temporal por evento, calibración y sensibilidad por segmento, revisión de costos y capacidad, monitoreo de deriva y un mecanismo de reversión. Esta deuda técnica queda visible en el tablero; no se oculta detrás de una métrica alta.</w:t>
-      </w:r>
-    </w:p>
-    <w:p>
-      <w:r>
-        <w:t>Fuentes: temas 13 y 14 y rúbrica Actividad 6 proporcionados; Financial PhraseBank (Malo et al.), revisión HF 8d3fe0c; scikit-learn, documentación de ajuste de umbral y CalibratedClassifierCV; SciPy, fisher_exact y binomtest; MLflow Tracking; normativa de fondos BBVA México. Las URLs completas y evidencias están en el README del repositorio.</w:t>
+        <w:t>Conclusión y gobierno del siguiente paso</w:t>
+      </w:r>
+    </w:p>
+    <w:p>
+      <w:r>
+        <w:t>Mantengo SVM 0.20 como candidata académica; la meta conjunta de recall ≥0.90 y precisión ≥0.60 no se alcanza. Con ánimo de avanzar responsablemente, necesito datos mexicanos con licencia apta, separación temporal por evento, evaluación por segmento, capacidad operativa, monitoreo de deriva y reversión. La deuda técnica y el riesgo reputacional quedan visibles. La IA no sustituye el criterio del banquero; lo aumenta.</w:t>
+      </w:r>
+    </w:p>
+    <w:p>
+      <w:r>
+        <w:t>Las evidencias incluyen cuaderno con salidas, scripts, modelos, predicciones, MLflow y tablero. La reproducibilidad no equivale a eficacia financiera. Este trabajo es personal y académico, no un producto ni una recomendación oficial de BBVA.</w:t>
+      </w:r>
+    </w:p>
+    <w:p>
+      <w:pPr>
+        <w:keepNext/>
+      </w:pPr>
+      <w:r>
+        <w:rPr>
+          <w:i/>
+          <w:sz w:val="18"/>
+        </w:rPr>
+        <w:t>Tabla 8. Cobertura de la rúbrica</w:t>
+      </w:r>
+    </w:p>
+    <w:tbl>
+      <w:tblPr>
+        <w:tblW w:type="auto" w:w="0"/>
+        <w:tblLayout w:type="fixed"/>
+        <w:tblLook w:firstColumn="1" w:firstRow="1" w:lastColumn="0" w:lastRow="0" w:noHBand="0" w:noVBand="1" w:val="04A0"/>
+      </w:tblPr>
+      <w:tblGrid>
+        <w:gridCol w:w="3120"/>
+        <w:gridCol w:w="3120"/>
+        <w:gridCol w:w="3120"/>
+      </w:tblGrid>
+      <w:tr>
+        <w:trPr>
+          <w:cantSplit/>
+          <w:tblHeader/>
+        </w:trPr>
+        <w:tc>
+          <w:tcPr>
+            <w:tcW w:type="dxa" w:w="2448"/>
+            <w:shd w:fill="004481"/>
+          </w:tcPr>
+          <w:p>
+            <w:pPr>
+              <w:spacing w:after="60" w:before="60"/>
+            </w:pPr>
+            <w:r>
+              <w:rPr>
+                <w:b/>
+                <w:color w:val="FFFFFF"/>
+                <w:sz w:val="18"/>
+              </w:rPr>
+              <w:t>Criterio 25 %</w:t>
+            </w:r>
+          </w:p>
+        </w:tc>
+        <w:tc>
+          <w:tcPr>
+            <w:tcW w:type="dxa" w:w="2880"/>
+            <w:shd w:fill="004481"/>
+          </w:tcPr>
+          <w:p>
+            <w:pPr>
+              <w:spacing w:after="60" w:before="60"/>
+            </w:pPr>
+            <w:r>
+              <w:rPr>
+                <w:b/>
+                <w:color w:val="FFFFFF"/>
+                <w:sz w:val="18"/>
+              </w:rPr>
+              <w:t>Sección y página</w:t>
+            </w:r>
+          </w:p>
+        </w:tc>
+        <w:tc>
+          <w:tcPr>
+            <w:tcW w:type="dxa" w:w="4032"/>
+            <w:shd w:fill="004481"/>
+          </w:tcPr>
+          <w:p>
+            <w:pPr>
+              <w:spacing w:after="60" w:before="60"/>
+            </w:pPr>
+            <w:r>
+              <w:rPr>
+                <w:b/>
+                <w:color w:val="FFFFFF"/>
+                <w:sz w:val="18"/>
+              </w:rPr>
+              <w:t>Evidencia</w:t>
+            </w:r>
+          </w:p>
+        </w:tc>
+      </w:tr>
+      <w:tr>
+        <w:trPr>
+          <w:cantSplit/>
+        </w:trPr>
+        <w:tc>
+          <w:tcPr>
+            <w:tcW w:type="dxa" w:w="2448"/>
+            <w:shd w:fill="F1F6FA"/>
+          </w:tcPr>
+          <w:p>
+            <w:pPr>
+              <w:spacing w:after="60" w:before="60"/>
+            </w:pPr>
+            <w:r>
+              <w:rPr>
+                <w:b w:val="0"/>
+                <w:color w:val="222222"/>
+                <w:sz w:val="18"/>
+              </w:rPr>
+              <w:t>1. Problema y métricas</w:t>
+            </w:r>
+          </w:p>
+        </w:tc>
+        <w:tc>
+          <w:tcPr>
+            <w:tcW w:type="dxa" w:w="2880"/>
+            <w:shd w:fill="F1F6FA"/>
+          </w:tcPr>
+          <w:p>
+            <w:pPr>
+              <w:spacing w:after="60" w:before="60"/>
+            </w:pPr>
+            <w:r>
+              <w:rPr>
+                <w:b w:val="0"/>
+                <w:color w:val="222222"/>
+                <w:sz w:val="18"/>
+              </w:rPr>
+              <w:t>Decisión p. 3; matriz p. 5</w:t>
+            </w:r>
+          </w:p>
+        </w:tc>
+        <w:tc>
+          <w:tcPr>
+            <w:tcW w:type="dxa" w:w="4032"/>
+            <w:shd w:fill="F1F6FA"/>
+          </w:tcPr>
+          <w:p>
+            <w:pPr>
+              <w:spacing w:after="60" w:before="60"/>
+            </w:pPr>
+            <w:r>
+              <w:rPr>
+                <w:b w:val="0"/>
+                <w:color w:val="222222"/>
+                <w:sz w:val="18"/>
+              </w:rPr>
+              <w:t>SMART; TP/FN/FP/TN; cálculos y propósito.</w:t>
+            </w:r>
+          </w:p>
+        </w:tc>
+      </w:tr>
+      <w:tr>
+        <w:trPr>
+          <w:cantSplit/>
+        </w:trPr>
+        <w:tc>
+          <w:tcPr>
+            <w:tcW w:type="dxa" w:w="2448"/>
+            <w:shd w:fill="FFFFFF"/>
+          </w:tcPr>
+          <w:p>
+            <w:pPr>
+              <w:spacing w:after="60" w:before="60"/>
+            </w:pPr>
+            <w:r>
+              <w:rPr>
+                <w:b w:val="0"/>
+                <w:color w:val="222222"/>
+                <w:sz w:val="18"/>
+              </w:rPr>
+              <w:t>2. Evaluación y umbral</w:t>
+            </w:r>
+          </w:p>
+        </w:tc>
+        <w:tc>
+          <w:tcPr>
+            <w:tcW w:type="dxa" w:w="2880"/>
+            <w:shd w:fill="FFFFFF"/>
+          </w:tcPr>
+          <w:p>
+            <w:pPr>
+              <w:spacing w:after="60" w:before="60"/>
+            </w:pPr>
+            <w:r>
+              <w:rPr>
+                <w:b w:val="0"/>
+                <w:color w:val="222222"/>
+                <w:sz w:val="18"/>
+              </w:rPr>
+              <w:t>Escenarios p. 5; curvas p. 6</w:t>
+            </w:r>
+          </w:p>
+        </w:tc>
+        <w:tc>
+          <w:tcPr>
+            <w:tcW w:type="dxa" w:w="4032"/>
+            <w:shd w:fill="FFFFFF"/>
+          </w:tcPr>
+          <w:p>
+            <w:pPr>
+              <w:spacing w:after="60" w:before="60"/>
+            </w:pPr>
+            <w:r>
+              <w:rPr>
+                <w:b w:val="0"/>
+                <w:color w:val="222222"/>
+                <w:sz w:val="18"/>
+              </w:rPr>
+              <w:t>Tabla 4; ROC, PR, Brier y fiabilidad.</w:t>
+            </w:r>
+          </w:p>
+        </w:tc>
+      </w:tr>
+      <w:tr>
+        <w:trPr>
+          <w:cantSplit/>
+        </w:trPr>
+        <w:tc>
+          <w:tcPr>
+            <w:tcW w:type="dxa" w:w="2448"/>
+            <w:shd w:fill="F1F6FA"/>
+          </w:tcPr>
+          <w:p>
+            <w:pPr>
+              <w:spacing w:after="60" w:before="60"/>
+            </w:pPr>
+            <w:r>
+              <w:rPr>
+                <w:b w:val="0"/>
+                <w:color w:val="222222"/>
+                <w:sz w:val="18"/>
+              </w:rPr>
+              <w:t>3. Validación y comparación</w:t>
+            </w:r>
+          </w:p>
+        </w:tc>
+        <w:tc>
+          <w:tcPr>
+            <w:tcW w:type="dxa" w:w="2880"/>
+            <w:shd w:fill="F1F6FA"/>
+          </w:tcPr>
+          <w:p>
+            <w:pPr>
+              <w:spacing w:after="60" w:before="60"/>
+            </w:pPr>
+            <w:r>
+              <w:rPr>
+                <w:b w:val="0"/>
+                <w:color w:val="222222"/>
+                <w:sz w:val="18"/>
+              </w:rPr>
+              <w:t>Validación p. 7; A/B p. 8</w:t>
+            </w:r>
+          </w:p>
+        </w:tc>
+        <w:tc>
+          <w:tcPr>
+            <w:tcW w:type="dxa" w:w="4032"/>
+            <w:shd w:fill="F1F6FA"/>
+          </w:tcPr>
+          <w:p>
+            <w:pPr>
+              <w:spacing w:after="60" w:before="60"/>
+            </w:pPr>
+            <w:r>
+              <w:rPr>
+                <w:b w:val="0"/>
+                <w:color w:val="222222"/>
+                <w:sz w:val="18"/>
+              </w:rPr>
+              <w:t>CV, baselines, IC, McNemar, Fisher y Tabla 7.</w:t>
+            </w:r>
+          </w:p>
+        </w:tc>
+      </w:tr>
+      <w:tr>
+        <w:trPr>
+          <w:cantSplit/>
+        </w:trPr>
+        <w:tc>
+          <w:tcPr>
+            <w:tcW w:type="dxa" w:w="2448"/>
+            <w:shd w:fill="FFFFFF"/>
+          </w:tcPr>
+          <w:p>
+            <w:pPr>
+              <w:spacing w:after="60" w:before="60"/>
+            </w:pPr>
+            <w:r>
+              <w:rPr>
+                <w:b w:val="0"/>
+                <w:color w:val="222222"/>
+                <w:sz w:val="18"/>
+              </w:rPr>
+              <w:t>4. Integración y presentación</w:t>
+            </w:r>
+          </w:p>
+        </w:tc>
+        <w:tc>
+          <w:tcPr>
+            <w:tcW w:type="dxa" w:w="2880"/>
+            <w:shd w:fill="FFFFFF"/>
+          </w:tcPr>
+          <w:p>
+            <w:pPr>
+              <w:spacing w:after="60" w:before="60"/>
+            </w:pPr>
+            <w:r>
+              <w:rPr>
+                <w:b w:val="0"/>
+                <w:color w:val="222222"/>
+                <w:sz w:val="18"/>
+              </w:rPr>
+              <w:t>Impacto p. 9; visuales pp. 5–8</w:t>
+            </w:r>
+          </w:p>
+        </w:tc>
+        <w:tc>
+          <w:tcPr>
+            <w:tcW w:type="dxa" w:w="4032"/>
+            <w:shd w:fill="FFFFFF"/>
+          </w:tcPr>
+          <w:p>
+            <w:pPr>
+              <w:spacing w:after="60" w:before="60"/>
+            </w:pPr>
+            <w:r>
+              <w:rPr>
+                <w:b w:val="0"/>
+                <w:color w:val="222222"/>
+                <w:sz w:val="18"/>
+              </w:rPr>
+              <w:t>Decisión, costos, figuras, Trello y cuaderno.</w:t>
+            </w:r>
+          </w:p>
+        </w:tc>
+      </w:tr>
+    </w:tbl>
+    <w:p>
+      <w:r>
+        <w:t>Este reporte fue estructurado precisamente para cubrir esos 4 apartados de forma explícita y verificable.</w:t>
+      </w:r>
+    </w:p>
+    <w:p>
+      <w:r>
+        <w:br w:type="page"/>
+      </w:r>
+    </w:p>
+    <w:p>
+      <w:pPr>
+        <w:pStyle w:val="Ttulo1"/>
+      </w:pPr>
+      <w:r>
+        <w:t>Referencias</w:t>
+      </w:r>
+    </w:p>
+    <w:p>
+      <w:pPr>
+        <w:spacing w:after="140"/>
+        <w:ind w:left="317" w:hanging="317"/>
+      </w:pPr>
+      <w:r>
+        <w:rPr>
+          <w:sz w:val="18"/>
+        </w:rPr>
+        <w:t>BBVA México. (s. f.). Normativa de fondos. Recuperado el 23 de octubre de 2026, de https://www.bbva.mx/personas/productos/inversion/normativa-de-fondos.html</w:t>
+      </w:r>
+    </w:p>
+    <w:p>
+      <w:pPr>
+        <w:spacing w:after="140"/>
+        <w:ind w:left="317" w:hanging="317"/>
+      </w:pPr>
+      <w:r>
+        <w:rPr>
+          <w:sz w:val="18"/>
+        </w:rPr>
+        <w:t>Harris, C. R., Millman, K. J., van der Walt, S. J., Gommers, R., Virtanen, P., Cournapeau, D., Wieser, E., Taylor, J., Berg, S., Smith, N. J., Kern, R., Picus, M., Hoyer, S., van Kerkwijk, M. H., Brett, M., Haldane, A., Fernández del Río, J., Wiebe, M., Peterson, P., … Oliphant, T. E. (2020). Array programming with NumPy. Nature, 585, 357–362. https://doi.org/10.1038/s41586-020-2649-2</w:t>
+      </w:r>
+    </w:p>
+    <w:p>
+      <w:pPr>
+        <w:spacing w:after="140"/>
+        <w:ind w:left="317" w:hanging="317"/>
+      </w:pPr>
+      <w:r>
+        <w:rPr>
+          <w:sz w:val="18"/>
+        </w:rPr>
+        <w:t>Malo, P., Sinha, A., Korhonen, P., Wallenius, J., &amp; Takala, P. (2014). Good debt or bad debt: Detecting semantic orientations in economic texts. Journal of the Association for Information Science and Technology, 65(4), 782–796. https://doi.org/10.1002/asi.23062</w:t>
+      </w:r>
+    </w:p>
+    <w:p>
+      <w:pPr>
+        <w:spacing w:after="140"/>
+        <w:ind w:left="317" w:hanging="317"/>
+      </w:pPr>
+      <w:r>
+        <w:rPr>
+          <w:sz w:val="18"/>
+        </w:rPr>
+        <w:t>MLflow. (s. f.). ML experiment tracking. Recuperado el 23 de octubre de 2026, de https://mlflow.org/docs/latest/ml/tracking/</w:t>
+      </w:r>
+    </w:p>
+    <w:p>
+      <w:pPr>
+        <w:spacing w:after="140"/>
+        <w:ind w:left="317" w:hanging="317"/>
+      </w:pPr>
+      <w:r>
+        <w:rPr>
+          <w:sz w:val="18"/>
+        </w:rPr>
+        <w:t>Pedregosa, F., Varoquaux, G., Gramfort, A., Michel, V., Thirion, B., Grisel, O., Blondel, M., Prettenhofer, P., Weiss, R., Dubourg, V., VanderPlas, J., Passos, A., Cournapeau, D., Brucher, M., Perrot, M., &amp; Duchesnay, É. (2011). Scikit-learn: Machine learning in Python. Journal of Machine Learning Research, 12, 2825–2830. https://jmlr.org/papers/v12/pedregosa11a.html</w:t>
+      </w:r>
+    </w:p>
+    <w:p>
+      <w:pPr>
+        <w:spacing w:after="140"/>
+        <w:ind w:left="317" w:hanging="317"/>
+      </w:pPr>
+      <w:r>
+        <w:rPr>
+          <w:sz w:val="18"/>
+        </w:rPr>
+        <w:t>Takala, P. (s. f.). Financial PhraseBank [Conjunto de datos; AllAgree, revisión 8d3fe0c]. Hugging Face. https://huggingface.co/datasets/takala/financial_phrasebank/tree/8d3fe0c36d5feec6b3cc5e455b0fcb4820fb9964</w:t>
+      </w:r>
+    </w:p>
+    <w:p>
+      <w:pPr>
+        <w:spacing w:after="140"/>
+        <w:ind w:left="317" w:hanging="317"/>
+      </w:pPr>
+      <w:r>
+        <w:rPr>
+          <w:sz w:val="18"/>
+        </w:rPr>
+        <w:t>Universidad Tecmilenio. (2026a). Tema 13 [Material de curso]. Gestión de Proyectos de Inteligencia Artificial.</w:t>
+      </w:r>
+    </w:p>
+    <w:p>
+      <w:pPr>
+        <w:spacing w:after="140"/>
+        <w:ind w:left="317" w:hanging="317"/>
+      </w:pPr>
+      <w:r>
+        <w:rPr>
+          <w:sz w:val="18"/>
+        </w:rPr>
+        <w:t>Universidad Tecmilenio. (2026b). Tema 14 [Material de curso]. Gestión de Proyectos de Inteligencia Artificial.</w:t>
+      </w:r>
+    </w:p>
+    <w:p>
+      <w:pPr>
+        <w:spacing w:after="140"/>
+        <w:ind w:left="317" w:hanging="317"/>
+      </w:pPr>
+      <w:r>
+        <w:rPr>
+          <w:sz w:val="18"/>
+        </w:rPr>
+        <w:t>Universidad Tecmilenio. (2026c). Rúbrica de la Actividad 6 [Instrumento de evaluación]. Gestión de Proyectos de Inteligencia Artificial.</w:t>
+      </w:r>
+    </w:p>
+    <w:p>
+      <w:pPr>
+        <w:spacing w:after="140"/>
+        <w:ind w:left="317" w:hanging="317"/>
+      </w:pPr>
+      <w:r>
+        <w:rPr>
+          <w:sz w:val="18"/>
+        </w:rPr>
+        <w:t>Virtanen, P., Gommers, R., Oliphant, T. E., Haberland, M., Reddy, T., Cournapeau, D., Burovski, E., Peterson, P., Weckesser, W., Bright, J., van der Walt, S. J., Brett, M., Wilson, J., Millman, K. J., Mayorov, N., Nelson, A. R. J., Jones, E., Kern, R., Larson, E., … SciPy 1.0 Contributors. (2020). SciPy 1.0: Fundamental algorithms for scientific computing in Python. Nature Methods, 17, 261–272. https://doi.org/10.1038/s41592-019-0686-2</w:t>
+      </w:r>
+    </w:p>
+    <w:p>
+      <w:r>
+        <w:t>Nota bibliográfica. Se utiliza la autoría del artículo indicada por la ficha oficial del dataset. Los materiales docentes se citan para evaluación (Universidad Tecmilenio, 2026c) y no se redistribuyen.</w:t>
       </w:r>
     </w:p>
     <w:sectPr>

</xml_diff>